<commit_message>
docs: fix review findings in Dynamo XPU whitepaper
- Fix deprecated dynamo-crds Helm chart install step in Chapter 0
  (dynamo-crds is deprecated as of v1.0.0; CRDs are now managed by
  the Dynamo Operator as part of the dynamo-platform chart)
- Reclassify KVBM out of the 'Genuinely NVIDIA-specific' table into
  the feasible/in-progress table, consistent with its own row text
  describing it as active WIP with unmerged PRs #7946/#10520
- Remove broken cross-repo relative links to the llm-d whitepaper
- Remove leftover author-workflow commentary from chapter 05 and
  tracking.md (e.g. 'reference sample... follow this structure',
  'discovered via a follow-up grep scan')
- Regenerate PDF/docx deliverables with all fixes

Found via an independent sub-agent review against the original task
scope and the actual repo contents.

Co-authored-by: Copilot <223556219+Copilot@users.noreply.github.com>
</commit_message>
<xml_diff>
--- a/whitepaper/dynamo-whitepaper.docx
+++ b/whitepaper/dynamo-whitepaper.docx
@@ -1500,7 +1500,7 @@
         <w:rPr>
           <w:rStyle w:val="NormalTok"/>
         </w:rPr>
-        <w:t xml:space="preserve">dynamo-cloud</w:t>
+        <w:t xml:space="preserve">dynamo-system</w:t>
       </w:r>
       <w:r>
         <w:br/>
@@ -1551,7 +1551,7 @@
         <w:rPr>
           <w:rStyle w:val="CommentTok"/>
         </w:rPr>
-        <w:t xml:space="preserve"># e.g. v0.x.y, see repo releases</w:t>
+        <w:t xml:space="preserve"># match a version from the repo's releases</w:t>
       </w:r>
       <w:r>
         <w:br/>
@@ -1561,9 +1561,27 @@
       </w:r>
       <w:r>
         <w:rPr>
-          <w:rStyle w:val="CommentTok"/>
-        </w:rPr>
-        <w:t xml:space="preserve"># 1. Install core CRDs (cluster-scoped, install once per cluster)</w:t>
+          <w:rStyle w:val="ExtensionTok"/>
+        </w:rPr>
+        <w:t xml:space="preserve">helm</w:t>
+      </w:r>
+      <w:r>
+        <w:rPr>
+          <w:rStyle w:val="NormalTok"/>
+        </w:rPr>
+        <w:t xml:space="preserve"> fetch https://helm.ngc.nvidia.com/nvidia/ai-dynamo/charts/dynamo-platform-</w:t>
+      </w:r>
+      <w:r>
+        <w:rPr>
+          <w:rStyle w:val="VariableTok"/>
+        </w:rPr>
+        <w:t xml:space="preserve">${RELEASE_VERSION}</w:t>
+      </w:r>
+      <w:r>
+        <w:rPr>
+          <w:rStyle w:val="NormalTok"/>
+        </w:rPr>
+        <w:t xml:space="preserve">.tgz</w:t>
       </w:r>
       <w:r>
         <w:br/>
@@ -1578,7 +1596,19 @@
         <w:rPr>
           <w:rStyle w:val="NormalTok"/>
         </w:rPr>
-        <w:t xml:space="preserve"> install dynamo-crds </w:t>
+        <w:t xml:space="preserve"> install dynamo-platform dynamo-platform-</w:t>
+      </w:r>
+      <w:r>
+        <w:rPr>
+          <w:rStyle w:val="VariableTok"/>
+        </w:rPr>
+        <w:t xml:space="preserve">${RELEASE_VERSION}</w:t>
+      </w:r>
+      <w:r>
+        <w:rPr>
+          <w:rStyle w:val="NormalTok"/>
+        </w:rPr>
+        <w:t xml:space="preserve">.tgz </w:t>
       </w:r>
       <w:r>
         <w:rPr>
@@ -1593,7 +1623,31 @@
         <w:rPr>
           <w:rStyle w:val="NormalTok"/>
         </w:rPr>
-        <w:t xml:space="preserve">  oci://ghcr.io/ai-dynamo/dynamo-crds </w:t>
+        <w:t xml:space="preserve">  </w:t>
+      </w:r>
+      <w:r>
+        <w:rPr>
+          <w:rStyle w:val="AttributeTok"/>
+        </w:rPr>
+        <w:t xml:space="preserve">--namespace</w:t>
+      </w:r>
+      <w:r>
+        <w:rPr>
+          <w:rStyle w:val="NormalTok"/>
+        </w:rPr>
+        <w:t xml:space="preserve"> </w:t>
+      </w:r>
+      <w:r>
+        <w:rPr>
+          <w:rStyle w:val="VariableTok"/>
+        </w:rPr>
+        <w:t xml:space="preserve">${NAMESPACE}</w:t>
+      </w:r>
+      <w:r>
+        <w:rPr>
+          <w:rStyle w:val="NormalTok"/>
+        </w:rPr>
+        <w:t xml:space="preserve"> </w:t>
       </w:r>
       <w:r>
         <w:rPr>
@@ -1614,229 +1668,58 @@
         <w:rPr>
           <w:rStyle w:val="AttributeTok"/>
         </w:rPr>
-        <w:t xml:space="preserve">--version</w:t>
-      </w:r>
-      <w:r>
-        <w:rPr>
-          <w:rStyle w:val="NormalTok"/>
-        </w:rPr>
-        <w:t xml:space="preserve"> </w:t>
-      </w:r>
-      <w:r>
-        <w:rPr>
-          <w:rStyle w:val="VariableTok"/>
-        </w:rPr>
-        <w:t xml:space="preserve">${RELEASE_VERSION}</w:t>
-      </w:r>
-      <w:r>
-        <w:rPr>
-          <w:rStyle w:val="NormalTok"/>
-        </w:rPr>
-        <w:t xml:space="preserve"> </w:t>
-      </w:r>
-      <w:r>
-        <w:rPr>
-          <w:rStyle w:val="DataTypeTok"/>
-        </w:rPr>
-        <w:t xml:space="preserve">\</w:t>
-      </w:r>
-      <w:r>
-        <w:br/>
-      </w:r>
-      <w:r>
-        <w:rPr>
-          <w:rStyle w:val="NormalTok"/>
-        </w:rPr>
-        <w:t xml:space="preserve">  </w:t>
-      </w:r>
-      <w:r>
-        <w:rPr>
-          <w:rStyle w:val="AttributeTok"/>
-        </w:rPr>
-        <w:t xml:space="preserve">--namespace</w:t>
-      </w:r>
-      <w:r>
-        <w:rPr>
-          <w:rStyle w:val="NormalTok"/>
-        </w:rPr>
-        <w:t xml:space="preserve"> default</w:t>
-      </w:r>
-      <w:r>
-        <w:br/>
-      </w:r>
-      <w:r>
-        <w:br/>
-      </w:r>
-      <w:r>
-        <w:rPr>
-          <w:rStyle w:val="CommentTok"/>
-        </w:rPr>
-        <w:t xml:space="preserve"># 2. Install the Dynamo Platform (operator + supporting services) into your namespace</w:t>
-      </w:r>
-      <w:r>
-        <w:br/>
-      </w:r>
-      <w:r>
-        <w:rPr>
-          <w:rStyle w:val="ExtensionTok"/>
-        </w:rPr>
-        <w:t xml:space="preserve">kubectl</w:t>
-      </w:r>
-      <w:r>
-        <w:rPr>
-          <w:rStyle w:val="NormalTok"/>
-        </w:rPr>
-        <w:t xml:space="preserve"> create namespace </w:t>
-      </w:r>
-      <w:r>
-        <w:rPr>
-          <w:rStyle w:val="VariableTok"/>
-        </w:rPr>
-        <w:t xml:space="preserve">${NAMESPACE}</w:t>
-      </w:r>
-      <w:r>
-        <w:rPr>
-          <w:rStyle w:val="NormalTok"/>
-        </w:rPr>
-        <w:t xml:space="preserve"> </w:t>
-      </w:r>
-      <w:r>
-        <w:rPr>
-          <w:rStyle w:val="DecValTok"/>
-        </w:rPr>
-        <w:t xml:space="preserve">2</w:t>
-      </w:r>
-      <w:r>
-        <w:rPr>
-          <w:rStyle w:val="OperatorTok"/>
-        </w:rPr>
-        <w:t xml:space="preserve">&gt;</w:t>
-      </w:r>
-      <w:r>
-        <w:rPr>
-          <w:rStyle w:val="NormalTok"/>
-        </w:rPr>
-        <w:t xml:space="preserve">/dev/null </w:t>
-      </w:r>
-      <w:r>
-        <w:rPr>
-          <w:rStyle w:val="KeywordTok"/>
-        </w:rPr>
-        <w:t xml:space="preserve">||</w:t>
-      </w:r>
-      <w:r>
-        <w:rPr>
-          <w:rStyle w:val="NormalTok"/>
-        </w:rPr>
-        <w:t xml:space="preserve"> </w:t>
-      </w:r>
-      <w:r>
-        <w:rPr>
-          <w:rStyle w:val="FunctionTok"/>
-        </w:rPr>
-        <w:t xml:space="preserve">true</w:t>
-      </w:r>
-      <w:r>
-        <w:br/>
-      </w:r>
-      <w:r>
-        <w:rPr>
-          <w:rStyle w:val="ExtensionTok"/>
-        </w:rPr>
-        <w:t xml:space="preserve">helm</w:t>
-      </w:r>
-      <w:r>
-        <w:rPr>
-          <w:rStyle w:val="NormalTok"/>
-        </w:rPr>
-        <w:t xml:space="preserve"> install dynamo-platform </w:t>
-      </w:r>
-      <w:r>
-        <w:rPr>
-          <w:rStyle w:val="DataTypeTok"/>
-        </w:rPr>
-        <w:t xml:space="preserve">\</w:t>
-      </w:r>
-      <w:r>
-        <w:br/>
-      </w:r>
-      <w:r>
-        <w:rPr>
-          <w:rStyle w:val="NormalTok"/>
-        </w:rPr>
-        <w:t xml:space="preserve">  oci://ghcr.io/ai-dynamo/dynamo-platform </w:t>
-      </w:r>
-      <w:r>
-        <w:rPr>
-          <w:rStyle w:val="DataTypeTok"/>
-        </w:rPr>
-        <w:t xml:space="preserve">\</w:t>
-      </w:r>
-      <w:r>
-        <w:br/>
-      </w:r>
-      <w:r>
-        <w:rPr>
-          <w:rStyle w:val="NormalTok"/>
-        </w:rPr>
-        <w:t xml:space="preserve">  </w:t>
-      </w:r>
-      <w:r>
-        <w:rPr>
-          <w:rStyle w:val="AttributeTok"/>
-        </w:rPr>
-        <w:t xml:space="preserve">--version</w:t>
-      </w:r>
-      <w:r>
-        <w:rPr>
-          <w:rStyle w:val="NormalTok"/>
-        </w:rPr>
-        <w:t xml:space="preserve"> </w:t>
-      </w:r>
-      <w:r>
-        <w:rPr>
-          <w:rStyle w:val="VariableTok"/>
-        </w:rPr>
-        <w:t xml:space="preserve">${RELEASE_VERSION}</w:t>
-      </w:r>
-      <w:r>
-        <w:rPr>
-          <w:rStyle w:val="NormalTok"/>
-        </w:rPr>
-        <w:t xml:space="preserve"> </w:t>
-      </w:r>
-      <w:r>
-        <w:rPr>
-          <w:rStyle w:val="DataTypeTok"/>
-        </w:rPr>
-        <w:t xml:space="preserve">\</w:t>
-      </w:r>
-      <w:r>
-        <w:br/>
-      </w:r>
-      <w:r>
-        <w:rPr>
-          <w:rStyle w:val="NormalTok"/>
-        </w:rPr>
-        <w:t xml:space="preserve">  </w:t>
-      </w:r>
-      <w:r>
-        <w:rPr>
-          <w:rStyle w:val="AttributeTok"/>
-        </w:rPr>
-        <w:t xml:space="preserve">--namespace</w:t>
-      </w:r>
-      <w:r>
-        <w:rPr>
-          <w:rStyle w:val="NormalTok"/>
-        </w:rPr>
-        <w:t xml:space="preserve"> </w:t>
-      </w:r>
-      <w:r>
-        <w:rPr>
-          <w:rStyle w:val="VariableTok"/>
-        </w:rPr>
-        <w:t xml:space="preserve">${NAMESPACE}</w:t>
+        <w:t xml:space="preserve">--create-namespace</w:t>
+      </w:r>
+    </w:p>
+    <w:p>
+      <w:pPr>
+        <w:pStyle w:val="BlockText"/>
+      </w:pPr>
+      <w:r>
+        <w:rPr>
+          <w:bCs/>
+          <w:b/>
+        </w:rPr>
+        <w:t xml:space="preserve">Note</w:t>
+      </w:r>
+      <w:r>
+        <w:t xml:space="preserve">: the</w:t>
+      </w:r>
+      <w:r>
+        <w:t xml:space="preserve"> </w:t>
+      </w:r>
+      <w:r>
+        <w:rPr>
+          <w:rStyle w:val="VerbatimChar"/>
+        </w:rPr>
+        <w:t xml:space="preserve">dynamo-crds</w:t>
+      </w:r>
+      <w:r>
+        <w:t xml:space="preserve"> </w:t>
+      </w:r>
+      <w:r>
+        <w:t xml:space="preserve">Helm chart referenced by some older instructions is deprecated as of</w:t>
+      </w:r>
+      <w:r>
+        <w:t xml:space="preserve"> </w:t>
+      </w:r>
+      <w:r>
+        <w:t xml:space="preserve">v1.0.0 — CRDs are now installed and managed by the Dynamo Operator itself as part of the</w:t>
+      </w:r>
+      <w:r>
+        <w:t xml:space="preserve"> </w:t>
+      </w:r>
+      <w:r>
+        <w:rPr>
+          <w:rStyle w:val="VerbatimChar"/>
+        </w:rPr>
+        <w:t xml:space="preserve">dynamo-platform</w:t>
+      </w:r>
+      <w:r>
+        <w:t xml:space="preserve"> </w:t>
+      </w:r>
+      <w:r>
+        <w:t xml:space="preserve">chart above. No separate CRD install step is needed on current releases.</w:t>
       </w:r>
     </w:p>
     <w:p>
@@ -5559,13 +5442,7 @@
         <w:t xml:space="preserve">Status</w:t>
       </w:r>
       <w:r>
-        <w:t xml:space="preserve">: 🚧 documented from repo, not yet run hands-on. (Written as the reference sample for</w:t>
-      </w:r>
-      <w:r>
-        <w:t xml:space="preserve"> </w:t>
-      </w:r>
-      <w:r>
-        <w:t xml:space="preserve">this whitepaper; follow this structure when completing the remaining chapters.)</w:t>
+        <w:t xml:space="preserve">: 🚧 documented from repo, not yet run hands-on.</w:t>
       </w:r>
     </w:p>
     <w:p>
@@ -13402,7 +13279,7 @@
     </w:tbl>
     <w:bookmarkEnd w:id="65"/>
     <w:bookmarkEnd w:id="66"/>
-    <w:bookmarkStart w:id="77" w:name="X902d638eacc236052ea377f4bf633e8bfa67ff8"/>
+    <w:bookmarkStart w:id="75" w:name="X902d638eacc236052ea377f4bf633e8bfa67ff8"/>
     <w:p>
       <w:pPr>
         <w:pStyle w:val="Heading1"/>
@@ -13411,7 +13288,7 @@
         <w:t xml:space="preserve">Chapter 4 — Feasible but Not Yet Supported on Intel XPU</w:t>
       </w:r>
     </w:p>
-    <w:bookmarkStart w:id="67" w:name="X3a6665bb2fe42657f50ae659816f7f9843f296d"/>
+    <w:bookmarkStart w:id="70" w:name="X3a6665bb2fe42657f50ae659816f7f9843f296d"/>
     <w:p>
       <w:pPr>
         <w:pStyle w:val="Heading2"/>
@@ -13820,6 +13697,107 @@
               <w:jc w:val="left"/>
             </w:pPr>
             <w:r>
+              <w:t xml:space="preserve">KVBM (multi-tier KV cache: GPU→CPU→SSD→remote)</w:t>
+            </w:r>
+          </w:p>
+        </w:tc>
+        <w:tc>
+          <w:tcPr/>
+          <w:p>
+            <w:pPr>
+              <w:pStyle w:val="Compact"/>
+              <w:jc w:val="left"/>
+            </w:pPr>
+            <w:r>
+              <w:rPr>
+                <w:rStyle w:val="VerbatimChar"/>
+              </w:rPr>
+              <w:t xml:space="preserve">backends/vllm/deploy/agg_kvbm.yaml</w:t>
+            </w:r>
+            <w:r>
+              <w:t xml:space="preserve">,</w:t>
+            </w:r>
+            <w:r>
+              <w:t xml:space="preserve"> </w:t>
+            </w:r>
+            <w:r>
+              <w:rPr>
+                <w:rStyle w:val="VerbatimChar"/>
+              </w:rPr>
+              <w:t xml:space="preserve">disagg_kvbm*.yaml</w:t>
+            </w:r>
+          </w:p>
+        </w:tc>
+        <w:tc>
+          <w:tcPr/>
+          <w:p>
+            <w:pPr>
+              <w:pStyle w:val="Compact"/>
+              <w:jc w:val="left"/>
+            </w:pPr>
+            <w:r>
+              <w:t xml:space="preserve">Intel XPU support is real, active work-in-progress, not yet merged: PRs</w:t>
+            </w:r>
+            <w:r>
+              <w:t xml:space="preserve"> </w:t>
+            </w:r>
+            <w:hyperlink r:id="rId67">
+              <w:r>
+                <w:rPr>
+                  <w:rStyle w:val="Hyperlink"/>
+                </w:rPr>
+                <w:t xml:space="preserve">#7946</w:t>
+              </w:r>
+            </w:hyperlink>
+            <w:r>
+              <w:t xml:space="preserve"> </w:t>
+            </w:r>
+            <w:r>
+              <w:t xml:space="preserve">and</w:t>
+            </w:r>
+            <w:r>
+              <w:t xml:space="preserve"> </w:t>
+            </w:r>
+            <w:hyperlink r:id="rId68">
+              <w:r>
+                <w:rPr>
+                  <w:rStyle w:val="Hyperlink"/>
+                </w:rPr>
+                <w:t xml:space="preserve">#10520</w:t>
+              </w:r>
+            </w:hyperlink>
+            <w:r>
+              <w:t xml:space="preserve"> </w:t>
+            </w:r>
+            <w:r>
+              <w:t xml:space="preserve">add SYCL/Level-Zero XPU support to KVBM v2, tracked by DEP issue</w:t>
+            </w:r>
+            <w:r>
+              <w:t xml:space="preserve"> </w:t>
+            </w:r>
+            <w:hyperlink r:id="rId69">
+              <w:r>
+                <w:rPr>
+                  <w:rStyle w:val="Hyperlink"/>
+                </w:rPr>
+                <w:t xml:space="preserve">#9313</w:t>
+              </w:r>
+            </w:hyperlink>
+            <w:r>
+              <w:t xml:space="preserve">, still in design discussion</w:t>
+            </w:r>
+          </w:p>
+        </w:tc>
+      </w:tr>
+      <w:tr>
+        <w:tc>
+          <w:tcPr/>
+          <w:p>
+            <w:pPr>
+              <w:pStyle w:val="Compact"/>
+              <w:jc w:val="left"/>
+            </w:pPr>
+            <w:r>
               <w:t xml:space="preserve">SGLang backend (all patterns)</w:t>
             </w:r>
           </w:p>
@@ -13936,7 +13914,7 @@
         <w:t xml:space="preserve">of candidate work, not a completed case.</w:t>
       </w:r>
     </w:p>
-    <w:bookmarkEnd w:id="67"/>
+    <w:bookmarkEnd w:id="70"/>
     <w:bookmarkStart w:id="71" w:name="X87c8055be3ada57933f24d444a8679e01407f1b"/>
     <w:p>
       <w:pPr>
@@ -14023,107 +14001,6 @@
               <w:jc w:val="left"/>
             </w:pPr>
             <w:r>
-              <w:t xml:space="preserve">KVBM (multi-tier KV cache: GPU→CPU→SSD→remote)</w:t>
-            </w:r>
-          </w:p>
-        </w:tc>
-        <w:tc>
-          <w:tcPr/>
-          <w:p>
-            <w:pPr>
-              <w:pStyle w:val="Compact"/>
-              <w:jc w:val="left"/>
-            </w:pPr>
-            <w:r>
-              <w:rPr>
-                <w:rStyle w:val="VerbatimChar"/>
-              </w:rPr>
-              <w:t xml:space="preserve">backends/vllm/deploy/agg_kvbm.yaml</w:t>
-            </w:r>
-            <w:r>
-              <w:t xml:space="preserve">,</w:t>
-            </w:r>
-            <w:r>
-              <w:t xml:space="preserve"> </w:t>
-            </w:r>
-            <w:r>
-              <w:rPr>
-                <w:rStyle w:val="VerbatimChar"/>
-              </w:rPr>
-              <w:t xml:space="preserve">disagg_kvbm*.yaml</w:t>
-            </w:r>
-          </w:p>
-        </w:tc>
-        <w:tc>
-          <w:tcPr/>
-          <w:p>
-            <w:pPr>
-              <w:pStyle w:val="Compact"/>
-              <w:jc w:val="left"/>
-            </w:pPr>
-            <w:r>
-              <w:t xml:space="preserve">Intel XPU support is real, active work-in-progress, not yet merged: PRs</w:t>
-            </w:r>
-            <w:r>
-              <w:t xml:space="preserve"> </w:t>
-            </w:r>
-            <w:hyperlink r:id="rId68">
-              <w:r>
-                <w:rPr>
-                  <w:rStyle w:val="Hyperlink"/>
-                </w:rPr>
-                <w:t xml:space="preserve">#7946</w:t>
-              </w:r>
-            </w:hyperlink>
-            <w:r>
-              <w:t xml:space="preserve"> </w:t>
-            </w:r>
-            <w:r>
-              <w:t xml:space="preserve">and</w:t>
-            </w:r>
-            <w:r>
-              <w:t xml:space="preserve"> </w:t>
-            </w:r>
-            <w:hyperlink r:id="rId69">
-              <w:r>
-                <w:rPr>
-                  <w:rStyle w:val="Hyperlink"/>
-                </w:rPr>
-                <w:t xml:space="preserve">#10520</w:t>
-              </w:r>
-            </w:hyperlink>
-            <w:r>
-              <w:t xml:space="preserve"> </w:t>
-            </w:r>
-            <w:r>
-              <w:t xml:space="preserve">add SYCL/Level-Zero XPU support to KVBM v2, tracked by DEP issue</w:t>
-            </w:r>
-            <w:r>
-              <w:t xml:space="preserve"> </w:t>
-            </w:r>
-            <w:hyperlink r:id="rId70">
-              <w:r>
-                <w:rPr>
-                  <w:rStyle w:val="Hyperlink"/>
-                </w:rPr>
-                <w:t xml:space="preserve">#9313</w:t>
-              </w:r>
-            </w:hyperlink>
-            <w:r>
-              <w:t xml:space="preserve">, still in design discussion</w:t>
-            </w:r>
-          </w:p>
-        </w:tc>
-      </w:tr>
-      <w:tr>
-        <w:tc>
-          <w:tcPr/>
-          <w:p>
-            <w:pPr>
-              <w:pStyle w:val="Compact"/>
-              <w:jc w:val="left"/>
-            </w:pPr>
-            <w:r>
               <w:t xml:space="preserve">TensorRT-LLM backend (all patterns, incl. multimodal: Qwen3-VL, Llama4, LLaVA, Qwen2-VL)</w:t>
             </w:r>
           </w:p>
@@ -14283,7 +14160,7 @@
       </w:r>
     </w:p>
     <w:bookmarkEnd w:id="72"/>
-    <w:bookmarkStart w:id="75" w:name="X60879ca28c7302647f9608367a1ce4d16915dfd"/>
+    <w:bookmarkStart w:id="73" w:name="X60879ca28c7302647f9608367a1ce4d16915dfd"/>
     <w:p>
       <w:pPr>
         <w:pStyle w:val="Heading2"/>
@@ -14386,39 +14263,14 @@
       <w:r>
         <w:t xml:space="preserve"> </w:t>
       </w:r>
-      <w:hyperlink r:id="rId73">
-        <w:r>
-          <w:rPr>
-            <w:rStyle w:val="Hyperlink"/>
-          </w:rPr>
-          <w:t xml:space="preserve">Flow Control</w:t>
-        </w:r>
-      </w:hyperlink>
-      <w:r>
-        <w:t xml:space="preserve"> </w:t>
-      </w:r>
-      <w:r>
-        <w:t xml:space="preserve">and</w:t>
-      </w:r>
-      <w:r>
-        <w:t xml:space="preserve"> </w:t>
-      </w:r>
-      <w:hyperlink r:id="rId74">
-        <w:r>
-          <w:rPr>
-            <w:rStyle w:val="Hyperlink"/>
-          </w:rPr>
-          <w:t xml:space="preserve">Multi-Model Routing</w:t>
-        </w:r>
-      </w:hyperlink>
-      <w:r>
-        <w:t xml:space="preserve">,</w:t>
-      </w:r>
-      <w:r>
-        <w:t xml:space="preserve"> </w:t>
-      </w:r>
-      <w:r>
-        <w:t xml:space="preserve">both of which are already confirmed hardware-agnostic and Intel-XPU-compatible in this whitepaper.</w:t>
+      <w:r>
+        <w:t xml:space="preserve">Flow Control and Multi-Model Routing (Chapters 2 and 3 of the companion llm-d whitepaper),</w:t>
+      </w:r>
+      <w:r>
+        <w:t xml:space="preserve"> </w:t>
+      </w:r>
+      <w:r>
+        <w:t xml:space="preserve">both of which are already confirmed hardware-agnostic and Intel-XPU-compatible there.</w:t>
       </w:r>
       <w:r>
         <w:t xml:space="preserve"> </w:t>
@@ -14439,147 +14291,147 @@
         <w:t xml:space="preserve"> </w:t>
       </w:r>
       <w:r>
-        <w:t xml:space="preserve">a strong feasible-but-untemplated candidate as well, resolving the</w:t>
-      </w:r>
-      <w:r>
-        <w:t xml:space="preserve"> </w:t>
-      </w:r>
-      <w:r>
-        <w:t xml:space="preserve">previously open</w:t>
-      </w:r>
-      <w:r>
-        <w:t xml:space="preserve"> </w:t>
-      </w:r>
-      <w:r>
-        <w:rPr>
-          <w:rStyle w:val="VerbatimChar"/>
-        </w:rPr>
-        <w:t xml:space="preserve">llmd-case-rl-scope-check</w:t>
-      </w:r>
-      <w:r>
-        <w:t xml:space="preserve"> </w:t>
-      </w:r>
-      <w:r>
-        <w:t xml:space="preserve">scope question with a concrete finding rather than</w:t>
-      </w:r>
-      <w:r>
-        <w:t xml:space="preserve"> </w:t>
-      </w:r>
-      <w:r>
-        <w:t xml:space="preserve">leaving it unconfirmed.</w:t>
-      </w:r>
-    </w:p>
+        <w:t xml:space="preserve">a strong feasible-but-untemplated candidate as well. It is not yet</w:t>
+      </w:r>
+      <w:r>
+        <w:t xml:space="preserve"> </w:t>
+      </w:r>
+      <w:r>
+        <w:t xml:space="preserve">written as a full chapter in the llm-d whitepaper — see</w:t>
+      </w:r>
+      <w:r>
+        <w:t xml:space="preserve"> </w:t>
+      </w:r>
+      <w:r>
+        <w:rPr>
+          <w:rStyle w:val="VerbatimChar"/>
+        </w:rPr>
+        <w:t xml:space="preserve">llm-d/tracking.md</w:t>
+      </w:r>
+      <w:r>
+        <w:t xml:space="preserve"> </w:t>
+      </w:r>
+      <w:r>
+        <w:t xml:space="preserve">for the</w:t>
+      </w:r>
+      <w:r>
+        <w:t xml:space="preserve"> </w:t>
+      </w:r>
+      <w:r>
+        <w:t xml:space="preserve">open scope question.</w:t>
+      </w:r>
+    </w:p>
+    <w:bookmarkEnd w:id="73"/>
+    <w:bookmarkStart w:id="74" w:name="if-you-want-to-close-these-gaps"/>
+    <w:p>
+      <w:pPr>
+        <w:pStyle w:val="Heading2"/>
+      </w:pPr>
+      <w:r>
+        <w:t xml:space="preserve">If you want to close these gaps</w:t>
+      </w:r>
+    </w:p>
+    <w:p>
+      <w:pPr>
+        <w:pStyle w:val="FirstParagraph"/>
+      </w:pPr>
+      <w:r>
+        <w:t xml:space="preserve">Building and validating any of the</w:t>
+      </w:r>
+      <w:r>
+        <w:t xml:space="preserve"> </w:t>
+      </w:r>
+      <w:r>
+        <w:t xml:space="preserve">“</w:t>
+      </w:r>
+      <w:r>
+        <w:t xml:space="preserve">feasible</w:t>
+      </w:r>
+      <w:r>
+        <w:t xml:space="preserve">”</w:t>
+      </w:r>
+      <w:r>
+        <w:t xml:space="preserve"> </w:t>
+      </w:r>
+      <w:r>
+        <w:t xml:space="preserve">candidates above on real Intel XPU hardware, then</w:t>
+      </w:r>
+      <w:r>
+        <w:t xml:space="preserve"> </w:t>
+      </w:r>
+      <w:r>
+        <w:t xml:space="preserve">contributing the resulting</w:t>
+      </w:r>
+      <w:r>
+        <w:t xml:space="preserve"> </w:t>
+      </w:r>
+      <w:r>
+        <w:rPr>
+          <w:rStyle w:val="VerbatimChar"/>
+        </w:rPr>
+        <w:t xml:space="preserve">xpu/</w:t>
+      </w:r>
+      <w:r>
+        <w:t xml:space="preserve"> </w:t>
+      </w:r>
+      <w:r>
+        <w:t xml:space="preserve">template upstream, is the most direct way to expand real Intel</w:t>
+      </w:r>
+      <w:r>
+        <w:t xml:space="preserve"> </w:t>
+      </w:r>
+      <w:r>
+        <w:t xml:space="preserve">XPU coverage — following the structural pattern of Chapter 1’s existing 8 templates (Intel DRA</w:t>
+      </w:r>
+      <w:r>
+        <w:t xml:space="preserve"> </w:t>
+      </w:r>
+      <w:r>
+        <w:t xml:space="preserve">device class</w:t>
+      </w:r>
+      <w:r>
+        <w:t xml:space="preserve"> </w:t>
+      </w:r>
+      <w:r>
+        <w:rPr>
+          <w:rStyle w:val="VerbatimChar"/>
+        </w:rPr>
+        <w:t xml:space="preserve">gpu.intel.com</w:t>
+      </w:r>
+      <w:r>
+        <w:t xml:space="preserve">, XCCL/</w:t>
+      </w:r>
+      <w:r>
+        <w:rPr>
+          <w:rStyle w:val="VerbatimChar"/>
+        </w:rPr>
+        <w:t xml:space="preserve">ze_copy</w:t>
+      </w:r>
+      <w:r>
+        <w:t xml:space="preserve"> </w:t>
+      </w:r>
+      <w:r>
+        <w:t xml:space="preserve">transport where NIXL/UCX is involved, custom</w:t>
+      </w:r>
+      <w:r>
+        <w:t xml:space="preserve"> </w:t>
+      </w:r>
+      <w:r>
+        <w:rPr>
+          <w:rStyle w:val="VerbatimChar"/>
+        </w:rPr>
+        <w:t xml:space="preserve">vllm-runtime-xpu</w:t>
+      </w:r>
+      <w:r>
+        <w:t xml:space="preserve"> </w:t>
+      </w:r>
+      <w:r>
+        <w:t xml:space="preserve">image).</w:t>
+      </w:r>
+    </w:p>
+    <w:bookmarkEnd w:id="74"/>
     <w:bookmarkEnd w:id="75"/>
-    <w:bookmarkStart w:id="76" w:name="if-you-want-to-close-these-gaps"/>
-    <w:p>
-      <w:pPr>
-        <w:pStyle w:val="Heading2"/>
-      </w:pPr>
-      <w:r>
-        <w:t xml:space="preserve">If you want to close these gaps</w:t>
-      </w:r>
-    </w:p>
-    <w:p>
-      <w:pPr>
-        <w:pStyle w:val="FirstParagraph"/>
-      </w:pPr>
-      <w:r>
-        <w:t xml:space="preserve">Building and validating any of the</w:t>
-      </w:r>
-      <w:r>
-        <w:t xml:space="preserve"> </w:t>
-      </w:r>
-      <w:r>
-        <w:t xml:space="preserve">“</w:t>
-      </w:r>
-      <w:r>
-        <w:t xml:space="preserve">feasible</w:t>
-      </w:r>
-      <w:r>
-        <w:t xml:space="preserve">”</w:t>
-      </w:r>
-      <w:r>
-        <w:t xml:space="preserve"> </w:t>
-      </w:r>
-      <w:r>
-        <w:t xml:space="preserve">candidates above on real Intel XPU hardware, then</w:t>
-      </w:r>
-      <w:r>
-        <w:t xml:space="preserve"> </w:t>
-      </w:r>
-      <w:r>
-        <w:t xml:space="preserve">contributing the resulting</w:t>
-      </w:r>
-      <w:r>
-        <w:t xml:space="preserve"> </w:t>
-      </w:r>
-      <w:r>
-        <w:rPr>
-          <w:rStyle w:val="VerbatimChar"/>
-        </w:rPr>
-        <w:t xml:space="preserve">xpu/</w:t>
-      </w:r>
-      <w:r>
-        <w:t xml:space="preserve"> </w:t>
-      </w:r>
-      <w:r>
-        <w:t xml:space="preserve">template upstream, is the most direct way to expand real Intel</w:t>
-      </w:r>
-      <w:r>
-        <w:t xml:space="preserve"> </w:t>
-      </w:r>
-      <w:r>
-        <w:t xml:space="preserve">XPU coverage — following the structural pattern of Chapter 1’s existing 8 templates (Intel DRA</w:t>
-      </w:r>
-      <w:r>
-        <w:t xml:space="preserve"> </w:t>
-      </w:r>
-      <w:r>
-        <w:t xml:space="preserve">device class</w:t>
-      </w:r>
-      <w:r>
-        <w:t xml:space="preserve"> </w:t>
-      </w:r>
-      <w:r>
-        <w:rPr>
-          <w:rStyle w:val="VerbatimChar"/>
-        </w:rPr>
-        <w:t xml:space="preserve">gpu.intel.com</w:t>
-      </w:r>
-      <w:r>
-        <w:t xml:space="preserve">, XCCL/</w:t>
-      </w:r>
-      <w:r>
-        <w:rPr>
-          <w:rStyle w:val="VerbatimChar"/>
-        </w:rPr>
-        <w:t xml:space="preserve">ze_copy</w:t>
-      </w:r>
-      <w:r>
-        <w:t xml:space="preserve"> </w:t>
-      </w:r>
-      <w:r>
-        <w:t xml:space="preserve">transport where NIXL/UCX is involved, custom</w:t>
-      </w:r>
-      <w:r>
-        <w:t xml:space="preserve"> </w:t>
-      </w:r>
-      <w:r>
-        <w:rPr>
-          <w:rStyle w:val="VerbatimChar"/>
-        </w:rPr>
-        <w:t xml:space="preserve">vllm-runtime-xpu</w:t>
-      </w:r>
-      <w:r>
-        <w:t xml:space="preserve"> </w:t>
-      </w:r>
-      <w:r>
-        <w:t xml:space="preserve">image).</w:t>
-      </w:r>
-    </w:p>
-    <w:bookmarkEnd w:id="76"/>
-    <w:bookmarkEnd w:id="77"/>
-    <w:bookmarkStart w:id="78" w:name="Xdbeb1f083631211312dfbd75b69c56d98d3c4a6"/>
+    <w:bookmarkStart w:id="76" w:name="Xdbeb1f083631211312dfbd75b69c56d98d3c4a6"/>
     <w:p>
       <w:pPr>
         <w:pStyle w:val="Heading1"/>
@@ -14975,8 +14827,8 @@
         </w:tc>
       </w:tr>
     </w:tbl>
-    <w:bookmarkEnd w:id="78"/>
-    <w:bookmarkStart w:id="79" w:name="appendix-b-known-issues-workarounds"/>
+    <w:bookmarkEnd w:id="76"/>
+    <w:bookmarkStart w:id="77" w:name="appendix-b-known-issues-workarounds"/>
     <w:p>
       <w:pPr>
         <w:pStyle w:val="Heading1"/>
@@ -15331,2001 +15183,7 @@
         <w:t xml:space="preserve">compatibility matrix.</w:t>
       </w:r>
     </w:p>
-    <w:bookmarkEnd w:id="79"/>
-    <w:bookmarkStart w:id="86" w:name="Xf1724c24e6111c5f5a4ca7d114723806e1154cb"/>
-    <w:p>
-      <w:pPr>
-        <w:pStyle w:val="Heading1"/>
-      </w:pPr>
-      <w:r>
-        <w:t xml:space="preserve">Dynamo Whitepaper — Case Verification Status Tracker</w:t>
-      </w:r>
-    </w:p>
-    <w:p>
-      <w:pPr>
-        <w:pStyle w:val="FirstParagraph"/>
-      </w:pPr>
-      <w:r>
-        <w:t xml:space="preserve">Status legend: ✅ verified working / 🚧 documented from official sources, not yet run hands-on /</w:t>
-      </w:r>
-      <w:r>
-        <w:t xml:space="preserve"> </w:t>
-      </w:r>
-      <w:r>
-        <w:t xml:space="preserve">📝 outline only / ⛔ blocked / ➖ not applicable (no Intel XPU support exists upstream)</w:t>
-      </w:r>
-    </w:p>
-    <w:bookmarkStart w:id="80" w:name="chapter-0-common-installation-1"/>
-    <w:p>
-      <w:pPr>
-        <w:pStyle w:val="Heading2"/>
-      </w:pPr>
-      <w:r>
-        <w:t xml:space="preserve">Chapter 0 — Common installation</w:t>
-      </w:r>
-    </w:p>
-    <w:tbl>
-      <w:tblPr>
-        <w:tblStyle w:val="Table"/>
-        <w:tblW w:type="pct" w:w="5000"/>
-        <w:tblLook w:firstRow="1" w:lastRow="0" w:firstColumn="0" w:lastColumn="0" w:noHBand="0" w:noVBand="0" w:val="0020"/>
-        <w:jc w:val="start"/>
-        <w:tblLayout w:type="fixed"/>
-      </w:tblPr>
-      <w:tblGrid>
-        <w:gridCol w:w="1980"/>
-        <w:gridCol w:w="1980"/>
-        <w:gridCol w:w="1980"/>
-        <w:gridCol w:w="1980"/>
-      </w:tblGrid>
-      <w:tr>
-        <w:trPr>
-          <w:tblHeader w:val="true"/>
-        </w:trPr>
-        <w:tc>
-          <w:tcPr/>
-          <w:p>
-            <w:pPr>
-              <w:pStyle w:val="Compact"/>
-              <w:jc w:val="left"/>
-            </w:pPr>
-            <w:r>
-              <w:t xml:space="preserve">Item</w:t>
-            </w:r>
-          </w:p>
-        </w:tc>
-        <w:tc>
-          <w:tcPr/>
-          <w:p>
-            <w:pPr>
-              <w:pStyle w:val="Compact"/>
-              <w:jc w:val="left"/>
-            </w:pPr>
-            <w:r>
-              <w:t xml:space="preserve">Status</w:t>
-            </w:r>
-          </w:p>
-        </w:tc>
-        <w:tc>
-          <w:tcPr/>
-          <w:p>
-            <w:pPr>
-              <w:pStyle w:val="Compact"/>
-              <w:jc w:val="left"/>
-            </w:pPr>
-            <w:r>
-              <w:t xml:space="preserve">Owner</w:t>
-            </w:r>
-          </w:p>
-        </w:tc>
-        <w:tc>
-          <w:tcPr/>
-          <w:p>
-            <w:pPr>
-              <w:pStyle w:val="Compact"/>
-              <w:jc w:val="left"/>
-            </w:pPr>
-            <w:r>
-              <w:t xml:space="preserve">Notes</w:t>
-            </w:r>
-          </w:p>
-        </w:tc>
-      </w:tr>
-      <w:tr>
-        <w:tc>
-          <w:tcPr/>
-          <w:p>
-            <w:pPr>
-              <w:pStyle w:val="Compact"/>
-              <w:jc w:val="left"/>
-            </w:pPr>
-            <w:r>
-              <w:t xml:space="preserve">Kubernetes + Dynamo Platform install (CRDs + operator)</w:t>
-            </w:r>
-          </w:p>
-        </w:tc>
-        <w:tc>
-          <w:tcPr/>
-          <w:p>
-            <w:pPr>
-              <w:pStyle w:val="Compact"/>
-              <w:jc w:val="left"/>
-            </w:pPr>
-            <w:r>
-              <w:t xml:space="preserve">🚧</w:t>
-            </w:r>
-          </w:p>
-        </w:tc>
-        <w:tc>
-          <w:tcPr/>
-          <w:p>
-            <w:pPr>
-              <w:pStyle w:val="Compact"/>
-            </w:pPr>
-          </w:p>
-        </w:tc>
-        <w:tc>
-          <w:tcPr/>
-          <w:p>
-            <w:pPr>
-              <w:pStyle w:val="Compact"/>
-              <w:jc w:val="left"/>
-            </w:pPr>
-            <w:r>
-              <w:t xml:space="preserve">Rewritten from</w:t>
-            </w:r>
-            <w:r>
-              <w:t xml:space="preserve"> </w:t>
-            </w:r>
-            <w:r>
-              <w:rPr>
-                <w:rStyle w:val="VerbatimChar"/>
-              </w:rPr>
-              <w:t xml:space="preserve">docs/kubernetes/installation-guide.md</w:t>
-            </w:r>
-            <w:r>
-              <w:t xml:space="preserve">, Intel-specific notes (skip GPU Operator, use Intel resource drivers) added</w:t>
-            </w:r>
-          </w:p>
-        </w:tc>
-      </w:tr>
-      <w:tr>
-        <w:tc>
-          <w:tcPr/>
-          <w:p>
-            <w:pPr>
-              <w:pStyle w:val="Compact"/>
-              <w:jc w:val="left"/>
-            </w:pPr>
-            <w:r>
-              <w:t xml:space="preserve">Intel resource drivers for Kubernetes + DeviceClass</w:t>
-            </w:r>
-            <w:r>
-              <w:t xml:space="preserve"> </w:t>
-            </w:r>
-            <w:r>
-              <w:rPr>
-                <w:rStyle w:val="VerbatimChar"/>
-              </w:rPr>
-              <w:t xml:space="preserve">gpu.intel.com</w:t>
-            </w:r>
-          </w:p>
-        </w:tc>
-        <w:tc>
-          <w:tcPr/>
-          <w:p>
-            <w:pPr>
-              <w:pStyle w:val="Compact"/>
-              <w:jc w:val="left"/>
-            </w:pPr>
-            <w:r>
-              <w:t xml:space="preserve">🚧</w:t>
-            </w:r>
-          </w:p>
-        </w:tc>
-        <w:tc>
-          <w:tcPr/>
-          <w:p>
-            <w:pPr>
-              <w:pStyle w:val="Compact"/>
-            </w:pPr>
-          </w:p>
-        </w:tc>
-        <w:tc>
-          <w:tcPr/>
-          <w:p>
-            <w:pPr>
-              <w:pStyle w:val="Compact"/>
-              <w:jc w:val="left"/>
-            </w:pPr>
-            <w:r>
-              <w:t xml:space="preserve">External dependency, not part of dynamo repo itself</w:t>
-            </w:r>
-          </w:p>
-        </w:tc>
-      </w:tr>
-      <w:tr>
-        <w:tc>
-          <w:tcPr/>
-          <w:p>
-            <w:pPr>
-              <w:pStyle w:val="Compact"/>
-              <w:jc w:val="left"/>
-            </w:pPr>
-            <w:r>
-              <w:t xml:space="preserve">Custom</w:t>
-            </w:r>
-            <w:r>
-              <w:t xml:space="preserve"> </w:t>
-            </w:r>
-            <w:r>
-              <w:rPr>
-                <w:rStyle w:val="VerbatimChar"/>
-              </w:rPr>
-              <w:t xml:space="preserve">vllm-runtime-xpu</w:t>
-            </w:r>
-            <w:r>
-              <w:t xml:space="preserve"> </w:t>
-            </w:r>
-            <w:r>
-              <w:t xml:space="preserve">image build</w:t>
-            </w:r>
-          </w:p>
-        </w:tc>
-        <w:tc>
-          <w:tcPr/>
-          <w:p>
-            <w:pPr>
-              <w:pStyle w:val="Compact"/>
-              <w:jc w:val="left"/>
-            </w:pPr>
-            <w:r>
-              <w:t xml:space="preserve">🚧</w:t>
-            </w:r>
-          </w:p>
-        </w:tc>
-        <w:tc>
-          <w:tcPr/>
-          <w:p>
-            <w:pPr>
-              <w:pStyle w:val="Compact"/>
-            </w:pPr>
-          </w:p>
-        </w:tc>
-        <w:tc>
-          <w:tcPr/>
-          <w:p>
-            <w:pPr>
-              <w:pStyle w:val="Compact"/>
-              <w:jc w:val="left"/>
-            </w:pPr>
-            <w:r>
-              <w:t xml:space="preserve">From</w:t>
-            </w:r>
-            <w:r>
-              <w:t xml:space="preserve"> </w:t>
-            </w:r>
-            <w:r>
-              <w:rPr>
-                <w:rStyle w:val="VerbatimChar"/>
-              </w:rPr>
-              <w:t xml:space="preserve">container/render.py</w:t>
-            </w:r>
-            <w:r>
-              <w:t xml:space="preserve"> </w:t>
-            </w:r>
-            <w:r>
-              <w:t xml:space="preserve">+</w:t>
-            </w:r>
-            <w:r>
-              <w:t xml:space="preserve"> </w:t>
-            </w:r>
-            <w:r>
-              <w:rPr>
-                <w:rStyle w:val="VerbatimChar"/>
-              </w:rPr>
-              <w:t xml:space="preserve">container/README.md</w:t>
-            </w:r>
-          </w:p>
-        </w:tc>
-      </w:tr>
-      <w:tr>
-        <w:tc>
-          <w:tcPr/>
-          <w:p>
-            <w:pPr>
-              <w:pStyle w:val="Compact"/>
-              <w:jc w:val="left"/>
-            </w:pPr>
-            <w:r>
-              <w:t xml:space="preserve">HF token secret</w:t>
-            </w:r>
-          </w:p>
-        </w:tc>
-        <w:tc>
-          <w:tcPr/>
-          <w:p>
-            <w:pPr>
-              <w:pStyle w:val="Compact"/>
-              <w:jc w:val="left"/>
-            </w:pPr>
-            <w:r>
-              <w:t xml:space="preserve">🚧</w:t>
-            </w:r>
-          </w:p>
-        </w:tc>
-        <w:tc>
-          <w:tcPr/>
-          <w:p>
-            <w:pPr>
-              <w:pStyle w:val="Compact"/>
-            </w:pPr>
-          </w:p>
-        </w:tc>
-        <w:tc>
-          <w:tcPr/>
-          <w:p>
-            <w:pPr>
-              <w:pStyle w:val="Compact"/>
-              <w:jc w:val="left"/>
-            </w:pPr>
-            <w:r>
-              <w:t xml:space="preserve">Standard step, same pattern across every template</w:t>
-            </w:r>
-          </w:p>
-        </w:tc>
-      </w:tr>
-    </w:tbl>
-    <w:bookmarkEnd w:id="80"/>
-    <w:bookmarkStart w:id="81" w:name="X0619ed6fe009056d2ff191d7913e17d03ab0673"/>
-    <w:p>
-      <w:pPr>
-        <w:pStyle w:val="Heading2"/>
-      </w:pPr>
-      <w:r>
-        <w:t xml:space="preserve">Chapter 1 — Intel XPU vLLM backend templates (</w:t>
-      </w:r>
-      <w:r>
-        <w:rPr>
-          <w:rStyle w:val="VerbatimChar"/>
-        </w:rPr>
-        <w:t xml:space="preserve">examples/backends/vllm/deploy/xpu/</w:t>
-      </w:r>
-      <w:r>
-        <w:t xml:space="preserve">)</w:t>
-      </w:r>
-    </w:p>
-    <w:tbl>
-      <w:tblPr>
-        <w:tblStyle w:val="Table"/>
-        <w:tblW w:type="pct" w:w="5000"/>
-        <w:tblLook w:firstRow="1" w:lastRow="0" w:firstColumn="0" w:lastColumn="0" w:noHBand="0" w:noVBand="0" w:val="0020"/>
-        <w:jc w:val="start"/>
-        <w:tblLayout w:type="fixed"/>
-      </w:tblPr>
-      <w:tblGrid>
-        <w:gridCol w:w="1320"/>
-        <w:gridCol w:w="1320"/>
-        <w:gridCol w:w="1320"/>
-        <w:gridCol w:w="1320"/>
-        <w:gridCol w:w="1320"/>
-        <w:gridCol w:w="1320"/>
-      </w:tblGrid>
-      <w:tr>
-        <w:trPr>
-          <w:tblHeader w:val="true"/>
-        </w:trPr>
-        <w:tc>
-          <w:tcPr/>
-          <w:p>
-            <w:pPr>
-              <w:pStyle w:val="Compact"/>
-              <w:jc w:val="left"/>
-            </w:pPr>
-            <w:r>
-              <w:t xml:space="preserve">#</w:t>
-            </w:r>
-          </w:p>
-        </w:tc>
-        <w:tc>
-          <w:tcPr/>
-          <w:p>
-            <w:pPr>
-              <w:pStyle w:val="Compact"/>
-              <w:jc w:val="left"/>
-            </w:pPr>
-            <w:r>
-              <w:t xml:space="preserve">Case</w:t>
-            </w:r>
-          </w:p>
-        </w:tc>
-        <w:tc>
-          <w:tcPr/>
-          <w:p>
-            <w:pPr>
-              <w:pStyle w:val="Compact"/>
-              <w:jc w:val="left"/>
-            </w:pPr>
-            <w:r>
-              <w:t xml:space="preserve">File</w:t>
-            </w:r>
-          </w:p>
-        </w:tc>
-        <w:tc>
-          <w:tcPr/>
-          <w:p>
-            <w:pPr>
-              <w:pStyle w:val="Compact"/>
-              <w:jc w:val="left"/>
-            </w:pPr>
-            <w:r>
-              <w:t xml:space="preserve">Status</w:t>
-            </w:r>
-          </w:p>
-        </w:tc>
-        <w:tc>
-          <w:tcPr/>
-          <w:p>
-            <w:pPr>
-              <w:pStyle w:val="Compact"/>
-              <w:jc w:val="left"/>
-            </w:pPr>
-            <w:r>
-              <w:t xml:space="preserve">Owner</w:t>
-            </w:r>
-          </w:p>
-        </w:tc>
-        <w:tc>
-          <w:tcPr/>
-          <w:p>
-            <w:pPr>
-              <w:pStyle w:val="Compact"/>
-              <w:jc w:val="left"/>
-            </w:pPr>
-            <w:r>
-              <w:t xml:space="preserve">Notes</w:t>
-            </w:r>
-          </w:p>
-        </w:tc>
-      </w:tr>
-      <w:tr>
-        <w:tc>
-          <w:tcPr/>
-          <w:p>
-            <w:pPr>
-              <w:pStyle w:val="Compact"/>
-              <w:jc w:val="left"/>
-            </w:pPr>
-            <w:r>
-              <w:t xml:space="preserve">1</w:t>
-            </w:r>
-          </w:p>
-        </w:tc>
-        <w:tc>
-          <w:tcPr/>
-          <w:p>
-            <w:pPr>
-              <w:pStyle w:val="Compact"/>
-              <w:jc w:val="left"/>
-            </w:pPr>
-            <w:r>
-              <w:t xml:space="preserve">Aggregated</w:t>
-            </w:r>
-          </w:p>
-        </w:tc>
-        <w:tc>
-          <w:tcPr/>
-          <w:p>
-            <w:pPr>
-              <w:pStyle w:val="Compact"/>
-              <w:jc w:val="left"/>
-            </w:pPr>
-            <w:r>
-              <w:rPr>
-                <w:rStyle w:val="VerbatimChar"/>
-              </w:rPr>
-              <w:t xml:space="preserve">agg_xpu_dra.yaml</w:t>
-            </w:r>
-          </w:p>
-        </w:tc>
-        <w:tc>
-          <w:tcPr/>
-          <w:p>
-            <w:pPr>
-              <w:pStyle w:val="Compact"/>
-              <w:jc w:val="left"/>
-            </w:pPr>
-            <w:r>
-              <w:t xml:space="preserve">🚧</w:t>
-            </w:r>
-          </w:p>
-        </w:tc>
-        <w:tc>
-          <w:tcPr/>
-          <w:p>
-            <w:pPr>
-              <w:pStyle w:val="Compact"/>
-            </w:pPr>
-          </w:p>
-        </w:tc>
-        <w:tc>
-          <w:tcPr/>
-          <w:p>
-            <w:pPr>
-              <w:pStyle w:val="Compact"/>
-            </w:pPr>
-          </w:p>
-        </w:tc>
-      </w:tr>
-      <w:tr>
-        <w:tc>
-          <w:tcPr/>
-          <w:p>
-            <w:pPr>
-              <w:pStyle w:val="Compact"/>
-              <w:jc w:val="left"/>
-            </w:pPr>
-            <w:r>
-              <w:t xml:space="preserve">2</w:t>
-            </w:r>
-          </w:p>
-        </w:tc>
-        <w:tc>
-          <w:tcPr/>
-          <w:p>
-            <w:pPr>
-              <w:pStyle w:val="Compact"/>
-              <w:jc w:val="left"/>
-            </w:pPr>
-            <w:r>
-              <w:t xml:space="preserve">Aggregated + Tracing</w:t>
-            </w:r>
-          </w:p>
-        </w:tc>
-        <w:tc>
-          <w:tcPr/>
-          <w:p>
-            <w:pPr>
-              <w:pStyle w:val="Compact"/>
-              <w:jc w:val="left"/>
-            </w:pPr>
-            <w:r>
-              <w:rPr>
-                <w:rStyle w:val="VerbatimChar"/>
-              </w:rPr>
-              <w:t xml:space="preserve">agg_tracing_xpu_dra.yaml</w:t>
-            </w:r>
-          </w:p>
-        </w:tc>
-        <w:tc>
-          <w:tcPr/>
-          <w:p>
-            <w:pPr>
-              <w:pStyle w:val="Compact"/>
-              <w:jc w:val="left"/>
-            </w:pPr>
-            <w:r>
-              <w:t xml:space="preserve">🚧</w:t>
-            </w:r>
-          </w:p>
-        </w:tc>
-        <w:tc>
-          <w:tcPr/>
-          <w:p>
-            <w:pPr>
-              <w:pStyle w:val="Compact"/>
-            </w:pPr>
-          </w:p>
-        </w:tc>
-        <w:tc>
-          <w:tcPr/>
-          <w:p>
-            <w:pPr>
-              <w:pStyle w:val="Compact"/>
-              <w:jc w:val="left"/>
-            </w:pPr>
-            <w:r>
-              <w:t xml:space="preserve">Needs an OTEL collector to fully validate</w:t>
-            </w:r>
-          </w:p>
-        </w:tc>
-      </w:tr>
-      <w:tr>
-        <w:tc>
-          <w:tcPr/>
-          <w:p>
-            <w:pPr>
-              <w:pStyle w:val="Compact"/>
-              <w:jc w:val="left"/>
-            </w:pPr>
-            <w:r>
-              <w:t xml:space="preserve">3</w:t>
-            </w:r>
-          </w:p>
-        </w:tc>
-        <w:tc>
-          <w:tcPr/>
-          <w:p>
-            <w:pPr>
-              <w:pStyle w:val="Compact"/>
-              <w:jc w:val="left"/>
-            </w:pPr>
-            <w:r>
-              <w:t xml:space="preserve">Aggregated + KV Router</w:t>
-            </w:r>
-          </w:p>
-        </w:tc>
-        <w:tc>
-          <w:tcPr/>
-          <w:p>
-            <w:pPr>
-              <w:pStyle w:val="Compact"/>
-              <w:jc w:val="left"/>
-            </w:pPr>
-            <w:r>
-              <w:rPr>
-                <w:rStyle w:val="VerbatimChar"/>
-              </w:rPr>
-              <w:t xml:space="preserve">agg_router_xpu_dra.yaml</w:t>
-            </w:r>
-          </w:p>
-        </w:tc>
-        <w:tc>
-          <w:tcPr/>
-          <w:p>
-            <w:pPr>
-              <w:pStyle w:val="Compact"/>
-              <w:jc w:val="left"/>
-            </w:pPr>
-            <w:r>
-              <w:t xml:space="preserve">🚧</w:t>
-            </w:r>
-          </w:p>
-        </w:tc>
-        <w:tc>
-          <w:tcPr/>
-          <w:p>
-            <w:pPr>
-              <w:pStyle w:val="Compact"/>
-            </w:pPr>
-          </w:p>
-        </w:tc>
-        <w:tc>
-          <w:tcPr/>
-          <w:p>
-            <w:pPr>
-              <w:pStyle w:val="Compact"/>
-              <w:jc w:val="left"/>
-            </w:pPr>
-            <w:r>
-              <w:t xml:space="preserve">KV-aware routing is limited in aggregated mode (see whitepaper §1.3)</w:t>
-            </w:r>
-          </w:p>
-        </w:tc>
-      </w:tr>
-      <w:tr>
-        <w:tc>
-          <w:tcPr/>
-          <w:p>
-            <w:pPr>
-              <w:pStyle w:val="Compact"/>
-              <w:jc w:val="left"/>
-            </w:pPr>
-            <w:r>
-              <w:t xml:space="preserve">4</w:t>
-            </w:r>
-          </w:p>
-        </w:tc>
-        <w:tc>
-          <w:tcPr/>
-          <w:p>
-            <w:pPr>
-              <w:pStyle w:val="Compact"/>
-              <w:jc w:val="left"/>
-            </w:pPr>
-            <w:r>
-              <w:t xml:space="preserve">Aggregated + KV Router (no-KV-events)</w:t>
-            </w:r>
-          </w:p>
-        </w:tc>
-        <w:tc>
-          <w:tcPr/>
-          <w:p>
-            <w:pPr>
-              <w:pStyle w:val="Compact"/>
-              <w:jc w:val="left"/>
-            </w:pPr>
-            <w:r>
-              <w:rPr>
-                <w:rStyle w:val="VerbatimChar"/>
-              </w:rPr>
-              <w:t xml:space="preserve">agg_router_kv_approx_xpu_dra.yaml</w:t>
-            </w:r>
-          </w:p>
-        </w:tc>
-        <w:tc>
-          <w:tcPr/>
-          <w:p>
-            <w:pPr>
-              <w:pStyle w:val="Compact"/>
-              <w:jc w:val="left"/>
-            </w:pPr>
-            <w:r>
-              <w:t xml:space="preserve">🚧</w:t>
-            </w:r>
-          </w:p>
-        </w:tc>
-        <w:tc>
-          <w:tcPr/>
-          <w:p>
-            <w:pPr>
-              <w:pStyle w:val="Compact"/>
-            </w:pPr>
-          </w:p>
-        </w:tc>
-        <w:tc>
-          <w:tcPr/>
-          <w:p>
-            <w:pPr>
-              <w:pStyle w:val="Compact"/>
-            </w:pPr>
-          </w:p>
-        </w:tc>
-      </w:tr>
-      <w:tr>
-        <w:tc>
-          <w:tcPr/>
-          <w:p>
-            <w:pPr>
-              <w:pStyle w:val="Compact"/>
-              <w:jc w:val="left"/>
-            </w:pPr>
-            <w:r>
-              <w:t xml:space="preserve">5</w:t>
-            </w:r>
-          </w:p>
-        </w:tc>
-        <w:tc>
-          <w:tcPr/>
-          <w:p>
-            <w:pPr>
-              <w:pStyle w:val="Compact"/>
-              <w:jc w:val="left"/>
-            </w:pPr>
-            <w:r>
-              <w:t xml:space="preserve">Disaggregated</w:t>
-            </w:r>
-          </w:p>
-        </w:tc>
-        <w:tc>
-          <w:tcPr/>
-          <w:p>
-            <w:pPr>
-              <w:pStyle w:val="Compact"/>
-              <w:jc w:val="left"/>
-            </w:pPr>
-            <w:r>
-              <w:rPr>
-                <w:rStyle w:val="VerbatimChar"/>
-              </w:rPr>
-              <w:t xml:space="preserve">disagg_xpu_dra.yaml</w:t>
-            </w:r>
-          </w:p>
-        </w:tc>
-        <w:tc>
-          <w:tcPr/>
-          <w:p>
-            <w:pPr>
-              <w:pStyle w:val="Compact"/>
-              <w:jc w:val="left"/>
-            </w:pPr>
-            <w:r>
-              <w:t xml:space="preserve">🚧</w:t>
-            </w:r>
-          </w:p>
-        </w:tc>
-        <w:tc>
-          <w:tcPr/>
-          <w:p>
-            <w:pPr>
-              <w:pStyle w:val="Compact"/>
-            </w:pPr>
-          </w:p>
-        </w:tc>
-        <w:tc>
-          <w:tcPr/>
-          <w:p>
-            <w:pPr>
-              <w:pStyle w:val="Compact"/>
-              <w:jc w:val="left"/>
-            </w:pPr>
-            <w:r>
-              <w:t xml:space="preserve">First deep-dive / sample case for this whitepaper</w:t>
-            </w:r>
-          </w:p>
-        </w:tc>
-      </w:tr>
-      <w:tr>
-        <w:tc>
-          <w:tcPr/>
-          <w:p>
-            <w:pPr>
-              <w:pStyle w:val="Compact"/>
-              <w:jc w:val="left"/>
-            </w:pPr>
-            <w:r>
-              <w:t xml:space="preserve">6</w:t>
-            </w:r>
-          </w:p>
-        </w:tc>
-        <w:tc>
-          <w:tcPr/>
-          <w:p>
-            <w:pPr>
-              <w:pStyle w:val="Compact"/>
-              <w:jc w:val="left"/>
-            </w:pPr>
-            <w:r>
-              <w:t xml:space="preserve">Disaggregated + Tracing</w:t>
-            </w:r>
-          </w:p>
-        </w:tc>
-        <w:tc>
-          <w:tcPr/>
-          <w:p>
-            <w:pPr>
-              <w:pStyle w:val="Compact"/>
-              <w:jc w:val="left"/>
-            </w:pPr>
-            <w:r>
-              <w:rPr>
-                <w:rStyle w:val="VerbatimChar"/>
-              </w:rPr>
-              <w:t xml:space="preserve">disagg_tracing_xpu_dra.yaml</w:t>
-            </w:r>
-          </w:p>
-        </w:tc>
-        <w:tc>
-          <w:tcPr/>
-          <w:p>
-            <w:pPr>
-              <w:pStyle w:val="Compact"/>
-              <w:jc w:val="left"/>
-            </w:pPr>
-            <w:r>
-              <w:t xml:space="preserve">🚧</w:t>
-            </w:r>
-          </w:p>
-        </w:tc>
-        <w:tc>
-          <w:tcPr/>
-          <w:p>
-            <w:pPr>
-              <w:pStyle w:val="Compact"/>
-            </w:pPr>
-          </w:p>
-        </w:tc>
-        <w:tc>
-          <w:tcPr/>
-          <w:p>
-            <w:pPr>
-              <w:pStyle w:val="Compact"/>
-            </w:pPr>
-          </w:p>
-        </w:tc>
-      </w:tr>
-      <w:tr>
-        <w:tc>
-          <w:tcPr/>
-          <w:p>
-            <w:pPr>
-              <w:pStyle w:val="Compact"/>
-              <w:jc w:val="left"/>
-            </w:pPr>
-            <w:r>
-              <w:t xml:space="preserve">7</w:t>
-            </w:r>
-          </w:p>
-        </w:tc>
-        <w:tc>
-          <w:tcPr/>
-          <w:p>
-            <w:pPr>
-              <w:pStyle w:val="Compact"/>
-              <w:jc w:val="left"/>
-            </w:pPr>
-            <w:r>
-              <w:t xml:space="preserve">Disaggregated + Planner</w:t>
-            </w:r>
-          </w:p>
-        </w:tc>
-        <w:tc>
-          <w:tcPr/>
-          <w:p>
-            <w:pPr>
-              <w:pStyle w:val="Compact"/>
-              <w:jc w:val="left"/>
-            </w:pPr>
-            <w:r>
-              <w:rPr>
-                <w:rStyle w:val="VerbatimChar"/>
-              </w:rPr>
-              <w:t xml:space="preserve">disagg_planner_xpu_dra.yaml</w:t>
-            </w:r>
-          </w:p>
-        </w:tc>
-        <w:tc>
-          <w:tcPr/>
-          <w:p>
-            <w:pPr>
-              <w:pStyle w:val="Compact"/>
-              <w:jc w:val="left"/>
-            </w:pPr>
-            <w:r>
-              <w:t xml:space="preserve">🚧</w:t>
-            </w:r>
-          </w:p>
-        </w:tc>
-        <w:tc>
-          <w:tcPr/>
-          <w:p>
-            <w:pPr>
-              <w:pStyle w:val="Compact"/>
-            </w:pPr>
-          </w:p>
-        </w:tc>
-        <w:tc>
-          <w:tcPr/>
-          <w:p>
-            <w:pPr>
-              <w:pStyle w:val="Compact"/>
-              <w:jc w:val="left"/>
-            </w:pPr>
-            <w:r>
-              <w:t xml:space="preserve">Sample profiling data is illustrative only, not measured on real Intel XPU hardware — replace before trusting Planner’s scaling decisions</w:t>
-            </w:r>
-          </w:p>
-        </w:tc>
-      </w:tr>
-      <w:tr>
-        <w:tc>
-          <w:tcPr/>
-          <w:p>
-            <w:pPr>
-              <w:pStyle w:val="Compact"/>
-              <w:jc w:val="left"/>
-            </w:pPr>
-            <w:r>
-              <w:t xml:space="preserve">8</w:t>
-            </w:r>
-          </w:p>
-        </w:tc>
-        <w:tc>
-          <w:tcPr/>
-          <w:p>
-            <w:pPr>
-              <w:pStyle w:val="Compact"/>
-              <w:jc w:val="left"/>
-            </w:pPr>
-            <w:r>
-              <w:t xml:space="preserve">Disaggregated + KV Router</w:t>
-            </w:r>
-          </w:p>
-        </w:tc>
-        <w:tc>
-          <w:tcPr/>
-          <w:p>
-            <w:pPr>
-              <w:pStyle w:val="Compact"/>
-              <w:jc w:val="left"/>
-            </w:pPr>
-            <w:r>
-              <w:rPr>
-                <w:rStyle w:val="VerbatimChar"/>
-              </w:rPr>
-              <w:t xml:space="preserve">disagg_router_xpu_dra.yaml</w:t>
-            </w:r>
-          </w:p>
-        </w:tc>
-        <w:tc>
-          <w:tcPr/>
-          <w:p>
-            <w:pPr>
-              <w:pStyle w:val="Compact"/>
-              <w:jc w:val="left"/>
-            </w:pPr>
-            <w:r>
-              <w:t xml:space="preserve">🚧</w:t>
-            </w:r>
-          </w:p>
-        </w:tc>
-        <w:tc>
-          <w:tcPr/>
-          <w:p>
-            <w:pPr>
-              <w:pStyle w:val="Compact"/>
-            </w:pPr>
-          </w:p>
-        </w:tc>
-        <w:tc>
-          <w:tcPr/>
-          <w:p>
-            <w:pPr>
-              <w:pStyle w:val="Compact"/>
-              <w:jc w:val="left"/>
-            </w:pPr>
-            <w:r>
-              <w:t xml:space="preserve">Recommended combo for genuine KV-aware routing on Intel XPU</w:t>
-            </w:r>
-          </w:p>
-        </w:tc>
-      </w:tr>
-    </w:tbl>
-    <w:bookmarkEnd w:id="81"/>
-    <w:bookmarkStart w:id="82" w:name="chapter-2-global-planner"/>
-    <w:p>
-      <w:pPr>
-        <w:pStyle w:val="Heading2"/>
-      </w:pPr>
-      <w:r>
-        <w:t xml:space="preserve">Chapter 2 — Global Planner</w:t>
-      </w:r>
-    </w:p>
-    <w:tbl>
-      <w:tblPr>
-        <w:tblStyle w:val="Table"/>
-        <w:tblW w:type="pct" w:w="5000"/>
-        <w:tblLook w:firstRow="1" w:lastRow="0" w:firstColumn="0" w:lastColumn="0" w:noHBand="0" w:noVBand="0" w:val="0020"/>
-        <w:jc w:val="start"/>
-        <w:tblLayout w:type="fixed"/>
-      </w:tblPr>
-      <w:tblGrid>
-        <w:gridCol w:w="1584"/>
-        <w:gridCol w:w="1584"/>
-        <w:gridCol w:w="1584"/>
-        <w:gridCol w:w="1584"/>
-        <w:gridCol w:w="1584"/>
-      </w:tblGrid>
-      <w:tr>
-        <w:trPr>
-          <w:tblHeader w:val="true"/>
-        </w:trPr>
-        <w:tc>
-          <w:tcPr/>
-          <w:p>
-            <w:pPr>
-              <w:pStyle w:val="Compact"/>
-              <w:jc w:val="left"/>
-            </w:pPr>
-            <w:r>
-              <w:t xml:space="preserve">Case</w:t>
-            </w:r>
-          </w:p>
-        </w:tc>
-        <w:tc>
-          <w:tcPr/>
-          <w:p>
-            <w:pPr>
-              <w:pStyle w:val="Compact"/>
-              <w:jc w:val="left"/>
-            </w:pPr>
-            <w:r>
-              <w:t xml:space="preserve">File</w:t>
-            </w:r>
-          </w:p>
-        </w:tc>
-        <w:tc>
-          <w:tcPr/>
-          <w:p>
-            <w:pPr>
-              <w:pStyle w:val="Compact"/>
-              <w:jc w:val="left"/>
-            </w:pPr>
-            <w:r>
-              <w:t xml:space="preserve">Status</w:t>
-            </w:r>
-          </w:p>
-        </w:tc>
-        <w:tc>
-          <w:tcPr/>
-          <w:p>
-            <w:pPr>
-              <w:pStyle w:val="Compact"/>
-              <w:jc w:val="left"/>
-            </w:pPr>
-            <w:r>
-              <w:t xml:space="preserve">Owner</w:t>
-            </w:r>
-          </w:p>
-        </w:tc>
-        <w:tc>
-          <w:tcPr/>
-          <w:p>
-            <w:pPr>
-              <w:pStyle w:val="Compact"/>
-              <w:jc w:val="left"/>
-            </w:pPr>
-            <w:r>
-              <w:t xml:space="preserve">Notes</w:t>
-            </w:r>
-          </w:p>
-        </w:tc>
-      </w:tr>
-      <w:tr>
-        <w:tc>
-          <w:tcPr/>
-          <w:p>
-            <w:pPr>
-              <w:pStyle w:val="Compact"/>
-              <w:jc w:val="left"/>
-            </w:pPr>
-            <w:r>
-              <w:t xml:space="preserve">Global Planner (multi-pool, TP1)</w:t>
-            </w:r>
-          </w:p>
-        </w:tc>
-        <w:tc>
-          <w:tcPr/>
-          <w:p>
-            <w:pPr>
-              <w:pStyle w:val="Compact"/>
-              <w:jc w:val="left"/>
-            </w:pPr>
-            <w:r>
-              <w:rPr>
-                <w:rStyle w:val="VerbatimChar"/>
-              </w:rPr>
-              <w:t xml:space="preserve">examples/global_planner/global-planner-vllm-test-xpu-dra.yaml</w:t>
-            </w:r>
-          </w:p>
-        </w:tc>
-        <w:tc>
-          <w:tcPr/>
-          <w:p>
-            <w:pPr>
-              <w:pStyle w:val="Compact"/>
-              <w:jc w:val="left"/>
-            </w:pPr>
-            <w:r>
-              <w:t xml:space="preserve">🚧</w:t>
-            </w:r>
-          </w:p>
-        </w:tc>
-        <w:tc>
-          <w:tcPr/>
-          <w:p>
-            <w:pPr>
-              <w:pStyle w:val="Compact"/>
-            </w:pPr>
-          </w:p>
-        </w:tc>
-        <w:tc>
-          <w:tcPr/>
-          <w:p>
-            <w:pPr>
-              <w:pStyle w:val="Compact"/>
-              <w:jc w:val="left"/>
-            </w:pPr>
-            <w:r>
-              <w:t xml:space="preserve">Requires RWX StorageClass</w:t>
-            </w:r>
-          </w:p>
-        </w:tc>
-      </w:tr>
-    </w:tbl>
-    <w:bookmarkEnd w:id="82"/>
-    <w:bookmarkStart w:id="83" w:name="X3555064d5914f9857b4e54b6a7c5aecfd4a83f2"/>
-    <w:p>
-      <w:pPr>
-        <w:pStyle w:val="Heading2"/>
-      </w:pPr>
-      <w:r>
-        <w:t xml:space="preserve">Chapter 3 — Recipe: Qwen3-VL-32B-FP8 heterogeneous hardware disaggregation</w:t>
-      </w:r>
-    </w:p>
-    <w:tbl>
-      <w:tblPr>
-        <w:tblStyle w:val="Table"/>
-        <w:tblW w:type="pct" w:w="5000"/>
-        <w:tblLook w:firstRow="1" w:lastRow="0" w:firstColumn="0" w:lastColumn="0" w:noHBand="0" w:noVBand="0" w:val="0020"/>
-        <w:jc w:val="start"/>
-        <w:tblLayout w:type="fixed"/>
-      </w:tblPr>
-      <w:tblGrid>
-        <w:gridCol w:w="1584"/>
-        <w:gridCol w:w="1584"/>
-        <w:gridCol w:w="1584"/>
-        <w:gridCol w:w="1584"/>
-        <w:gridCol w:w="1584"/>
-      </w:tblGrid>
-      <w:tr>
-        <w:trPr>
-          <w:tblHeader w:val="true"/>
-        </w:trPr>
-        <w:tc>
-          <w:tcPr/>
-          <w:p>
-            <w:pPr>
-              <w:pStyle w:val="Compact"/>
-              <w:jc w:val="left"/>
-            </w:pPr>
-            <w:r>
-              <w:t xml:space="preserve">Case</w:t>
-            </w:r>
-          </w:p>
-        </w:tc>
-        <w:tc>
-          <w:tcPr/>
-          <w:p>
-            <w:pPr>
-              <w:pStyle w:val="Compact"/>
-              <w:jc w:val="left"/>
-            </w:pPr>
-            <w:r>
-              <w:t xml:space="preserve">File</w:t>
-            </w:r>
-          </w:p>
-        </w:tc>
-        <w:tc>
-          <w:tcPr/>
-          <w:p>
-            <w:pPr>
-              <w:pStyle w:val="Compact"/>
-              <w:jc w:val="left"/>
-            </w:pPr>
-            <w:r>
-              <w:t xml:space="preserve">Status</w:t>
-            </w:r>
-          </w:p>
-        </w:tc>
-        <w:tc>
-          <w:tcPr/>
-          <w:p>
-            <w:pPr>
-              <w:pStyle w:val="Compact"/>
-              <w:jc w:val="left"/>
-            </w:pPr>
-            <w:r>
-              <w:t xml:space="preserve">Owner</w:t>
-            </w:r>
-          </w:p>
-        </w:tc>
-        <w:tc>
-          <w:tcPr/>
-          <w:p>
-            <w:pPr>
-              <w:pStyle w:val="Compact"/>
-              <w:jc w:val="left"/>
-            </w:pPr>
-            <w:r>
-              <w:t xml:space="preserve">Notes</w:t>
-            </w:r>
-          </w:p>
-        </w:tc>
-      </w:tr>
-      <w:tr>
-        <w:tc>
-          <w:tcPr/>
-          <w:p>
-            <w:pPr>
-              <w:pStyle w:val="Compact"/>
-              <w:jc w:val="left"/>
-            </w:pPr>
-            <w:r>
-              <w:t xml:space="preserve">Hetero XPU (encode) + NVIDIA GPU (decode) disaggregation</w:t>
-            </w:r>
-          </w:p>
-        </w:tc>
-        <w:tc>
-          <w:tcPr/>
-          <w:p>
-            <w:pPr>
-              <w:pStyle w:val="Compact"/>
-              <w:jc w:val="left"/>
-            </w:pPr>
-            <w:r>
-              <w:rPr>
-                <w:rStyle w:val="VerbatimChar"/>
-              </w:rPr>
-              <w:t xml:space="preserve">recipes/qwen3-vl-32b-fp8/vllm/hetero_hardware_disagg/</w:t>
-            </w:r>
-          </w:p>
-        </w:tc>
-        <w:tc>
-          <w:tcPr/>
-          <w:p>
-            <w:pPr>
-              <w:pStyle w:val="Compact"/>
-              <w:jc w:val="left"/>
-            </w:pPr>
-            <w:r>
-              <w:t xml:space="preserve">🚧</w:t>
-            </w:r>
-          </w:p>
-        </w:tc>
-        <w:tc>
-          <w:tcPr/>
-          <w:p>
-            <w:pPr>
-              <w:pStyle w:val="Compact"/>
-            </w:pPr>
-          </w:p>
-        </w:tc>
-        <w:tc>
-          <w:tcPr/>
-          <w:p>
-            <w:pPr>
-              <w:pStyle w:val="Compact"/>
-              <w:jc w:val="left"/>
-            </w:pPr>
-            <w:r>
-              <w:t xml:space="preserve">Discovered via a follow-up</w:t>
-            </w:r>
-            <w:r>
-              <w:t xml:space="preserve"> </w:t>
-            </w:r>
-            <w:r>
-              <w:rPr>
-                <w:rStyle w:val="VerbatimChar"/>
-              </w:rPr>
-              <w:t xml:space="preserve">grep -r xpu recipes/</w:t>
-            </w:r>
-            <w:r>
-              <w:t xml:space="preserve"> </w:t>
-            </w:r>
-            <w:r>
-              <w:t xml:space="preserve">scan; requires RDMA connectivity between an Intel XPU node and an NVIDIA GPU node — hardest prerequisite of any case in this whitepaper</w:t>
-            </w:r>
-          </w:p>
-        </w:tc>
-      </w:tr>
-    </w:tbl>
-    <w:bookmarkEnd w:id="83"/>
-    <w:bookmarkStart w:id="84" w:name="Xf6f8ce94257c5e765137475f5753e1c5feaae95"/>
-    <w:p>
-      <w:pPr>
-        <w:pStyle w:val="Heading2"/>
-      </w:pPr>
-      <w:r>
-        <w:t xml:space="preserve">Chapter 4 — Feasible but not yet templated for Intel XPU vs. genuinely NVIDIA-locked</w:t>
-      </w:r>
-    </w:p>
-    <w:tbl>
-      <w:tblPr>
-        <w:tblStyle w:val="Table"/>
-        <w:tblW w:type="pct" w:w="5000"/>
-        <w:tblLook w:firstRow="1" w:lastRow="0" w:firstColumn="0" w:lastColumn="0" w:noHBand="0" w:noVBand="0" w:val="0020"/>
-        <w:jc w:val="start"/>
-        <w:tblLayout w:type="fixed"/>
-      </w:tblPr>
-      <w:tblGrid>
-        <w:gridCol w:w="2640"/>
-        <w:gridCol w:w="2640"/>
-        <w:gridCol w:w="2640"/>
-      </w:tblGrid>
-      <w:tr>
-        <w:trPr>
-          <w:tblHeader w:val="true"/>
-        </w:trPr>
-        <w:tc>
-          <w:tcPr/>
-          <w:p>
-            <w:pPr>
-              <w:pStyle w:val="Compact"/>
-              <w:jc w:val="left"/>
-            </w:pPr>
-            <w:r>
-              <w:t xml:space="preserve">Feature</w:t>
-            </w:r>
-          </w:p>
-        </w:tc>
-        <w:tc>
-          <w:tcPr/>
-          <w:p>
-            <w:pPr>
-              <w:pStyle w:val="Compact"/>
-              <w:jc w:val="left"/>
-            </w:pPr>
-            <w:r>
-              <w:t xml:space="preserve">Path</w:t>
-            </w:r>
-          </w:p>
-        </w:tc>
-        <w:tc>
-          <w:tcPr/>
-          <w:p>
-            <w:pPr>
-              <w:pStyle w:val="Compact"/>
-              <w:jc w:val="left"/>
-            </w:pPr>
-            <w:r>
-              <w:t xml:space="preserve">Status</w:t>
-            </w:r>
-          </w:p>
-        </w:tc>
-      </w:tr>
-      <w:tr>
-        <w:tc>
-          <w:tcPr/>
-          <w:p>
-            <w:pPr>
-              <w:pStyle w:val="Compact"/>
-              <w:jc w:val="left"/>
-            </w:pPr>
-            <w:r>
-              <w:t xml:space="preserve">LoRA adapter serving</w:t>
-            </w:r>
-          </w:p>
-        </w:tc>
-        <w:tc>
-          <w:tcPr/>
-          <w:p>
-            <w:pPr>
-              <w:pStyle w:val="Compact"/>
-              <w:jc w:val="left"/>
-            </w:pPr>
-            <w:r>
-              <w:rPr>
-                <w:rStyle w:val="VerbatimChar"/>
-              </w:rPr>
-              <w:t xml:space="preserve">backends/vllm/deploy/lora/</w:t>
-            </w:r>
-          </w:p>
-        </w:tc>
-        <w:tc>
-          <w:tcPr/>
-          <w:p>
-            <w:pPr>
-              <w:pStyle w:val="Compact"/>
-              <w:jc w:val="left"/>
-            </w:pPr>
-            <w:r>
-              <w:t xml:space="preserve">⚠️ feasible, untemplated — plain vLLM, already proven on XPU via bash launch script</w:t>
-            </w:r>
-          </w:p>
-        </w:tc>
-      </w:tr>
-      <w:tr>
-        <w:tc>
-          <w:tcPr/>
-          <w:p>
-            <w:pPr>
-              <w:pStyle w:val="Compact"/>
-              <w:jc w:val="left"/>
-            </w:pPr>
-            <w:r>
-              <w:t xml:space="preserve">GAIE integration</w:t>
-            </w:r>
-          </w:p>
-        </w:tc>
-        <w:tc>
-          <w:tcPr/>
-          <w:p>
-            <w:pPr>
-              <w:pStyle w:val="Compact"/>
-              <w:jc w:val="left"/>
-            </w:pPr>
-            <w:r>
-              <w:rPr>
-                <w:rStyle w:val="VerbatimChar"/>
-              </w:rPr>
-              <w:t xml:space="preserve">backends/vllm/deploy/gaie/</w:t>
-            </w:r>
-          </w:p>
-        </w:tc>
-        <w:tc>
-          <w:tcPr/>
-          <w:p>
-            <w:pPr>
-              <w:pStyle w:val="Compact"/>
-              <w:jc w:val="left"/>
-            </w:pPr>
-            <w:r>
-              <w:t xml:space="preserve">⚠️ feasible, untemplated — same EPP/InferencePool pattern proven hardware-agnostic on llm-d side</w:t>
-            </w:r>
-          </w:p>
-        </w:tc>
-      </w:tr>
-      <w:tr>
-        <w:tc>
-          <w:tcPr/>
-          <w:p>
-            <w:pPr>
-              <w:pStyle w:val="Compact"/>
-              <w:jc w:val="left"/>
-            </w:pPr>
-            <w:r>
-              <w:t xml:space="preserve">Multi-node disaggregation</w:t>
-            </w:r>
-          </w:p>
-        </w:tc>
-        <w:tc>
-          <w:tcPr/>
-          <w:p>
-            <w:pPr>
-              <w:pStyle w:val="Compact"/>
-              <w:jc w:val="left"/>
-            </w:pPr>
-            <w:r>
-              <w:rPr>
-                <w:rStyle w:val="VerbatimChar"/>
-              </w:rPr>
-              <w:t xml:space="preserve">backends/vllm/deploy/disagg-multinode.yaml</w:t>
-            </w:r>
-          </w:p>
-        </w:tc>
-        <w:tc>
-          <w:tcPr/>
-          <w:p>
-            <w:pPr>
-              <w:pStyle w:val="Compact"/>
-              <w:jc w:val="left"/>
-            </w:pPr>
-            <w:r>
-              <w:t xml:space="preserve">⚠️ feasible, untemplated — same NIXL split as XPU-proven</w:t>
-            </w:r>
-            <w:r>
-              <w:t xml:space="preserve"> </w:t>
-            </w:r>
-            <w:r>
-              <w:rPr>
-                <w:rStyle w:val="VerbatimChar"/>
-              </w:rPr>
-              <w:t xml:space="preserve">xpu/disagg_xpu_dra.yaml</w:t>
-            </w:r>
-            <w:r>
-              <w:t xml:space="preserve">, just multi-node</w:t>
-            </w:r>
-          </w:p>
-        </w:tc>
-      </w:tr>
-      <w:tr>
-        <w:tc>
-          <w:tcPr/>
-          <w:p>
-            <w:pPr>
-              <w:pStyle w:val="Compact"/>
-              <w:jc w:val="left"/>
-            </w:pPr>
-            <w:r>
-              <w:t xml:space="preserve">GMS sidecar / failover</w:t>
-            </w:r>
-          </w:p>
-        </w:tc>
-        <w:tc>
-          <w:tcPr/>
-          <w:p>
-            <w:pPr>
-              <w:pStyle w:val="Compact"/>
-              <w:jc w:val="left"/>
-            </w:pPr>
-            <w:r>
-              <w:rPr>
-                <w:rStyle w:val="VerbatimChar"/>
-              </w:rPr>
-              <w:t xml:space="preserve">backends/vllm/deploy/agg_gms.yaml</w:t>
-            </w:r>
-            <w:r>
-              <w:t xml:space="preserve">,</w:t>
-            </w:r>
-            <w:r>
-              <w:t xml:space="preserve"> </w:t>
-            </w:r>
-            <w:r>
-              <w:rPr>
-                <w:rStyle w:val="VerbatimChar"/>
-              </w:rPr>
-              <w:t xml:space="preserve">agg_failover.yaml</w:t>
-            </w:r>
-            <w:r>
-              <w:t xml:space="preserve">,</w:t>
-            </w:r>
-            <w:r>
-              <w:t xml:space="preserve"> </w:t>
-            </w:r>
-            <w:r>
-              <w:rPr>
-                <w:rStyle w:val="VerbatimChar"/>
-              </w:rPr>
-              <w:t xml:space="preserve">gms-failover.yaml</w:t>
-            </w:r>
-          </w:p>
-        </w:tc>
-        <w:tc>
-          <w:tcPr/>
-          <w:p>
-            <w:pPr>
-              <w:pStyle w:val="Compact"/>
-              <w:jc w:val="left"/>
-            </w:pPr>
-            <w:r>
-              <w:t xml:space="preserve">⚠️ feasible, in-progress — GMS’s own design doc plans an Intel XPU backend (</w:t>
-            </w:r>
-            <w:r>
-              <w:t xml:space="preserve">“</w:t>
-            </w:r>
-            <w:r>
-              <w:t xml:space="preserve">Phase 2</w:t>
-            </w:r>
-            <w:r>
-              <w:t xml:space="preserve">”</w:t>
-            </w:r>
-            <w:r>
-              <w:t xml:space="preserve">), not yet built</w:t>
-            </w:r>
-          </w:p>
-        </w:tc>
-      </w:tr>
-      <w:tr>
-        <w:tc>
-          <w:tcPr/>
-          <w:p>
-            <w:pPr>
-              <w:pStyle w:val="Compact"/>
-              <w:jc w:val="left"/>
-            </w:pPr>
-            <w:r>
-              <w:t xml:space="preserve">SGLang backend (all patterns)</w:t>
-            </w:r>
-          </w:p>
-        </w:tc>
-        <w:tc>
-          <w:tcPr/>
-          <w:p>
-            <w:pPr>
-              <w:pStyle w:val="Compact"/>
-              <w:jc w:val="left"/>
-            </w:pPr>
-            <w:r>
-              <w:rPr>
-                <w:rStyle w:val="VerbatimChar"/>
-              </w:rPr>
-              <w:t xml:space="preserve">backends/sglang/deploy/</w:t>
-            </w:r>
-          </w:p>
-        </w:tc>
-        <w:tc>
-          <w:tcPr/>
-          <w:p>
-            <w:pPr>
-              <w:pStyle w:val="Compact"/>
-              <w:jc w:val="left"/>
-            </w:pPr>
-            <w:r>
-              <w:t xml:space="preserve">❓ unconfirmed — no XPU mention in dynamo docs; SGLang engine’s own Intel XPU support not independently verified</w:t>
-            </w:r>
-          </w:p>
-        </w:tc>
-      </w:tr>
-      <w:tr>
-        <w:tc>
-          <w:tcPr/>
-          <w:p>
-            <w:pPr>
-              <w:pStyle w:val="Compact"/>
-              <w:jc w:val="left"/>
-            </w:pPr>
-            <w:r>
-              <w:t xml:space="preserve">KVBM (multi-tier KV cache)</w:t>
-            </w:r>
-          </w:p>
-        </w:tc>
-        <w:tc>
-          <w:tcPr/>
-          <w:p>
-            <w:pPr>
-              <w:pStyle w:val="Compact"/>
-              <w:jc w:val="left"/>
-            </w:pPr>
-            <w:r>
-              <w:rPr>
-                <w:rStyle w:val="VerbatimChar"/>
-              </w:rPr>
-              <w:t xml:space="preserve">backends/vllm/deploy/agg_kvbm.yaml</w:t>
-            </w:r>
-            <w:r>
-              <w:t xml:space="preserve">,</w:t>
-            </w:r>
-            <w:r>
-              <w:t xml:space="preserve"> </w:t>
-            </w:r>
-            <w:r>
-              <w:rPr>
-                <w:rStyle w:val="VerbatimChar"/>
-              </w:rPr>
-              <w:t xml:space="preserve">disagg_kvbm*.yaml</w:t>
-            </w:r>
-          </w:p>
-        </w:tc>
-        <w:tc>
-          <w:tcPr/>
-          <w:p>
-            <w:pPr>
-              <w:pStyle w:val="Compact"/>
-              <w:jc w:val="left"/>
-            </w:pPr>
-            <w:r>
-              <w:t xml:space="preserve">🚧 active WIP — unmerged PRs #7946, #10520 add XPU support to KVBM v2, tracked by DEP #9313</w:t>
-            </w:r>
-          </w:p>
-        </w:tc>
-      </w:tr>
-      <w:tr>
-        <w:tc>
-          <w:tcPr/>
-          <w:p>
-            <w:pPr>
-              <w:pStyle w:val="Compact"/>
-              <w:jc w:val="left"/>
-            </w:pPr>
-            <w:r>
-              <w:t xml:space="preserve">TensorRT-LLM backend (incl. multimodal)</w:t>
-            </w:r>
-          </w:p>
-        </w:tc>
-        <w:tc>
-          <w:tcPr/>
-          <w:p>
-            <w:pPr>
-              <w:pStyle w:val="Compact"/>
-              <w:jc w:val="left"/>
-            </w:pPr>
-            <w:r>
-              <w:rPr>
-                <w:rStyle w:val="VerbatimChar"/>
-              </w:rPr>
-              <w:t xml:space="preserve">backends/trtllm/</w:t>
-            </w:r>
-          </w:p>
-        </w:tc>
-        <w:tc>
-          <w:tcPr/>
-          <w:p>
-            <w:pPr>
-              <w:pStyle w:val="Compact"/>
-              <w:jc w:val="left"/>
-            </w:pPr>
-            <w:r>
-              <w:t xml:space="preserve">➖ NVIDIA-locked — TensorRT is a proprietary NVIDIA-only compiler/runtime</w:t>
-            </w:r>
-          </w:p>
-        </w:tc>
-      </w:tr>
-      <w:tr>
-        <w:tc>
-          <w:tcPr/>
-          <w:p>
-            <w:pPr>
-              <w:pStyle w:val="Compact"/>
-              <w:jc w:val="left"/>
-            </w:pPr>
-            <w:r>
-              <w:t xml:space="preserve">Triton Server backend</w:t>
-            </w:r>
-          </w:p>
-        </w:tc>
-        <w:tc>
-          <w:tcPr/>
-          <w:p>
-            <w:pPr>
-              <w:pStyle w:val="Compact"/>
-              <w:jc w:val="left"/>
-            </w:pPr>
-            <w:r>
-              <w:rPr>
-                <w:rStyle w:val="VerbatimChar"/>
-              </w:rPr>
-              <w:t xml:space="preserve">backends/tritonserver/</w:t>
-            </w:r>
-          </w:p>
-        </w:tc>
-        <w:tc>
-          <w:tcPr/>
-          <w:p>
-            <w:pPr>
-              <w:pStyle w:val="Compact"/>
-              <w:jc w:val="left"/>
-            </w:pPr>
-            <w:r>
-              <w:t xml:space="preserve">❓ unconfirmed — not investigated in depth</w:t>
-            </w:r>
-          </w:p>
-        </w:tc>
-      </w:tr>
-      <w:tr>
-        <w:tc>
-          <w:tcPr/>
-          <w:p>
-            <w:pPr>
-              <w:pStyle w:val="Compact"/>
-              <w:jc w:val="left"/>
-            </w:pPr>
-            <w:r>
-              <w:t xml:space="preserve">Recipes other than</w:t>
-            </w:r>
-            <w:r>
-              <w:t xml:space="preserve"> </w:t>
-            </w:r>
-            <w:r>
-              <w:rPr>
-                <w:rStyle w:val="VerbatimChar"/>
-              </w:rPr>
-              <w:t xml:space="preserve">qwen3-vl-32b-fp8</w:t>
-            </w:r>
-          </w:p>
-        </w:tc>
-        <w:tc>
-          <w:tcPr/>
-          <w:p>
-            <w:pPr>
-              <w:pStyle w:val="Compact"/>
-              <w:jc w:val="left"/>
-            </w:pPr>
-            <w:r>
-              <w:rPr>
-                <w:rStyle w:val="VerbatimChar"/>
-              </w:rPr>
-              <w:t xml:space="preserve">recipes/</w:t>
-            </w:r>
-          </w:p>
-        </w:tc>
-        <w:tc>
-          <w:tcPr/>
-          <w:p>
-            <w:pPr>
-              <w:pStyle w:val="Compact"/>
-              <w:jc w:val="left"/>
-            </w:pPr>
-            <w:r>
-              <w:t xml:space="preserve">➖ no other XPU content found; each would need individual feasibility review</w:t>
-            </w:r>
-          </w:p>
-        </w:tc>
-      </w:tr>
-    </w:tbl>
-    <w:bookmarkEnd w:id="84"/>
-    <w:bookmarkStart w:id="85" w:name="recommended-next-steps"/>
-    <w:p>
-      <w:pPr>
-        <w:pStyle w:val="Heading2"/>
-      </w:pPr>
-      <w:r>
-        <w:t xml:space="preserve">Recommended next steps</w:t>
-      </w:r>
-    </w:p>
-    <w:p>
-      <w:pPr>
-        <w:numPr>
-          <w:ilvl w:val="0"/>
-          <w:numId w:val="1008"/>
-        </w:numPr>
-        <w:pStyle w:val="Compact"/>
-      </w:pPr>
-      <w:r>
-        <w:t xml:space="preserve">Validate Chapter 1 cases on a real Intel XPU cluster, starting with</w:t>
-      </w:r>
-      <w:r>
-        <w:t xml:space="preserve"> </w:t>
-      </w:r>
-      <w:r>
-        <w:rPr>
-          <w:bCs/>
-          <w:b/>
-        </w:rPr>
-        <w:t xml:space="preserve">Disaggregated</w:t>
-      </w:r>
-      <w:r>
-        <w:t xml:space="preserve"> </w:t>
-      </w:r>
-      <w:r>
-        <w:t xml:space="preserve">(§1.5, already deep-dived) since it is the most representative pattern, then</w:t>
-      </w:r>
-      <w:r>
-        <w:t xml:space="preserve"> </w:t>
-      </w:r>
-      <w:r>
-        <w:rPr>
-          <w:bCs/>
-          <w:b/>
-        </w:rPr>
-        <w:t xml:space="preserve">Disaggregated + KV Router</w:t>
-      </w:r>
-      <w:r>
-        <w:t xml:space="preserve"> </w:t>
-      </w:r>
-      <w:r>
-        <w:t xml:space="preserve">(§1.8) as the</w:t>
-      </w:r>
-      <w:r>
-        <w:t xml:space="preserve"> </w:t>
-      </w:r>
-      <w:r>
-        <w:t xml:space="preserve">“</w:t>
-      </w:r>
-      <w:r>
-        <w:t xml:space="preserve">fully featured</w:t>
-      </w:r>
-      <w:r>
-        <w:t xml:space="preserve">”</w:t>
-      </w:r>
-      <w:r>
-        <w:t xml:space="preserve"> </w:t>
-      </w:r>
-      <w:r>
-        <w:t xml:space="preserve">case.</w:t>
-      </w:r>
-    </w:p>
-    <w:p>
-      <w:pPr>
-        <w:numPr>
-          <w:ilvl w:val="0"/>
-          <w:numId w:val="1008"/>
-        </w:numPr>
-        <w:pStyle w:val="Compact"/>
-      </w:pPr>
-      <w:r>
-        <w:t xml:space="preserve">Stand up a minimal OTEL collector (e.g. Grafana Tempo) to validate the two tracing variants</w:t>
-      </w:r>
-      <w:r>
-        <w:t xml:space="preserve"> </w:t>
-      </w:r>
-      <w:r>
-        <w:t xml:space="preserve">(§1.2, §1.6) end-to-end rather than just confirming the pods start.</w:t>
-      </w:r>
-    </w:p>
-    <w:p>
-      <w:pPr>
-        <w:numPr>
-          <w:ilvl w:val="0"/>
-          <w:numId w:val="1008"/>
-        </w:numPr>
-        <w:pStyle w:val="Compact"/>
-      </w:pPr>
-      <w:r>
-        <w:t xml:space="preserve">Profile real Intel XPU prefill/decode throughput curves and replace the sample data in</w:t>
-      </w:r>
-      <w:r>
-        <w:t xml:space="preserve"> </w:t>
-      </w:r>
-      <w:r>
-        <w:rPr>
-          <w:rStyle w:val="VerbatimChar"/>
-        </w:rPr>
-        <w:t xml:space="preserve">disagg_planner_xpu_dra.yaml</w:t>
-      </w:r>
-      <w:r>
-        <w:t xml:space="preserve"> </w:t>
-      </w:r>
-      <w:r>
-        <w:t xml:space="preserve">(§1.7) before treating Planner recommendations as trustworthy.</w:t>
-      </w:r>
-    </w:p>
-    <w:p>
-      <w:pPr>
-        <w:numPr>
-          <w:ilvl w:val="0"/>
-          <w:numId w:val="1008"/>
-        </w:numPr>
-        <w:pStyle w:val="Compact"/>
-      </w:pPr>
-      <w:r>
-        <w:t xml:space="preserve">Validate the Chapter 3 heterogeneous recipe hands-on — this is the highest-complexity case</w:t>
-      </w:r>
-      <w:r>
-        <w:t xml:space="preserve"> </w:t>
-      </w:r>
-      <w:r>
-        <w:t xml:space="preserve">(cross-vendor RDMA + NIXL) and the most likely to surface real-world issues not visible from</w:t>
-      </w:r>
-      <w:r>
-        <w:t xml:space="preserve"> </w:t>
-      </w:r>
-      <w:r>
-        <w:t xml:space="preserve">reading the YAML alone.</w:t>
-      </w:r>
-    </w:p>
-    <w:bookmarkEnd w:id="85"/>
-    <w:bookmarkEnd w:id="86"/>
+    <w:bookmarkEnd w:id="77"/>
     <w:sectPr/>
   </w:body>
 </w:document>
@@ -17502,91 +15360,6 @@
     <w:lvl w:ilvl="8">
       <w:numFmt w:val="bullet"/>
       <w:lvlText w:val="•"/>
-      <w:lvlJc w:val="left"/>
-      <w:pPr>
-        <w:ind w:left="6480" w:hanging="480"/>
-      </w:pPr>
-    </w:lvl>
-  </w:abstractNum>
-  <w:abstractNum w:abstractNumId="99411">
-    <w:nsid w:val="A99411"/>
-    <w:multiLevelType w:val="multilevel"/>
-    <w:lvl w:ilvl="0">
-      <w:start w:val="1"/>
-      <w:numFmt w:val="decimal"/>
-      <w:lvlText w:val="%1."/>
-      <w:lvlJc w:val="left"/>
-      <w:pPr>
-        <w:ind w:left="720" w:hanging="480"/>
-      </w:pPr>
-    </w:lvl>
-    <w:lvl w:ilvl="1">
-      <w:start w:val="1"/>
-      <w:numFmt w:val="decimal"/>
-      <w:lvlText w:val="%2."/>
-      <w:lvlJc w:val="left"/>
-      <w:pPr>
-        <w:ind w:left="1440" w:hanging="480"/>
-      </w:pPr>
-    </w:lvl>
-    <w:lvl w:ilvl="2">
-      <w:start w:val="1"/>
-      <w:numFmt w:val="decimal"/>
-      <w:lvlText w:val="%3."/>
-      <w:lvlJc w:val="left"/>
-      <w:pPr>
-        <w:ind w:left="2160" w:hanging="480"/>
-      </w:pPr>
-    </w:lvl>
-    <w:lvl w:ilvl="3">
-      <w:start w:val="1"/>
-      <w:numFmt w:val="decimal"/>
-      <w:lvlText w:val="%4."/>
-      <w:lvlJc w:val="left"/>
-      <w:pPr>
-        <w:ind w:left="2880" w:hanging="480"/>
-      </w:pPr>
-    </w:lvl>
-    <w:lvl w:ilvl="4">
-      <w:start w:val="1"/>
-      <w:numFmt w:val="decimal"/>
-      <w:lvlText w:val="%5."/>
-      <w:lvlJc w:val="left"/>
-      <w:pPr>
-        <w:ind w:left="3600" w:hanging="480"/>
-      </w:pPr>
-    </w:lvl>
-    <w:lvl w:ilvl="5">
-      <w:start w:val="1"/>
-      <w:numFmt w:val="decimal"/>
-      <w:lvlText w:val="%6."/>
-      <w:lvlJc w:val="left"/>
-      <w:pPr>
-        <w:ind w:left="4320" w:hanging="480"/>
-      </w:pPr>
-    </w:lvl>
-    <w:lvl w:ilvl="6">
-      <w:start w:val="1"/>
-      <w:numFmt w:val="decimal"/>
-      <w:lvlText w:val="%7."/>
-      <w:lvlJc w:val="left"/>
-      <w:pPr>
-        <w:ind w:left="5040" w:hanging="480"/>
-      </w:pPr>
-    </w:lvl>
-    <w:lvl w:ilvl="7">
-      <w:start w:val="1"/>
-      <w:numFmt w:val="decimal"/>
-      <w:lvlText w:val="%8."/>
-      <w:lvlJc w:val="left"/>
-      <w:pPr>
-        <w:ind w:left="5760" w:hanging="480"/>
-      </w:pPr>
-    </w:lvl>
-    <w:lvl w:ilvl="8">
-      <w:start w:val="1"/>
-      <w:numFmt w:val="decimal"/>
-      <w:lvlText w:val="%9."/>
       <w:lvlJc w:val="left"/>
       <w:pPr>
         <w:ind w:left="6480" w:hanging="480"/>
@@ -17616,36 +15389,6 @@
   </w:num>
   <w:num w:numId="1007">
     <w:abstractNumId w:val="991"/>
-  </w:num>
-  <w:num w:numId="1008">
-    <w:abstractNumId w:val="99411"/>
-    <w:lvlOverride w:ilvl="0">
-      <w:startOverride w:val="1"/>
-    </w:lvlOverride>
-    <w:lvlOverride w:ilvl="1">
-      <w:startOverride w:val="1"/>
-    </w:lvlOverride>
-    <w:lvlOverride w:ilvl="2">
-      <w:startOverride w:val="1"/>
-    </w:lvlOverride>
-    <w:lvlOverride w:ilvl="3">
-      <w:startOverride w:val="1"/>
-    </w:lvlOverride>
-    <w:lvlOverride w:ilvl="4">
-      <w:startOverride w:val="1"/>
-    </w:lvlOverride>
-    <w:lvlOverride w:ilvl="5">
-      <w:startOverride w:val="1"/>
-    </w:lvlOverride>
-    <w:lvlOverride w:ilvl="6">
-      <w:startOverride w:val="1"/>
-    </w:lvlOverride>
-    <w:lvlOverride w:ilvl="7">
-      <w:startOverride w:val="1"/>
-    </w:lvlOverride>
-    <w:lvlOverride w:ilvl="8">
-      <w:startOverride w:val="1"/>
-    </w:lvlOverride>
   </w:num>
 </w:numbering>
 </file>

</xml_diff>

<commit_message>
docs: remove llm-d cross-references from Dynamo whitepaper
The Dynamo whitepaper is a standalone deliverable for this repo and
should not reference or depend on the separate llm-d whitepaper/repo.
Removed all llm-d mentions from index.md, 11-not-available-on-xpu.md,
tracking.md, and to_fi.md, rewording comparisons/analogies as
repo-self-contained statements. Regenerated PDF/docx deliverables.

Co-authored-by: Copilot <223556219+Copilot@users.noreply.github.com>
</commit_message>
<xml_diff>
--- a/whitepaper/dynamo-whitepaper.docx
+++ b/whitepaper/dynamo-whitepaper.docx
@@ -379,45 +379,6 @@
         <w:pStyle w:val="FirstParagraph"/>
       </w:pPr>
       <w:r>
-        <w:t xml:space="preserve">Unlike llm-d, where most</w:t>
-      </w:r>
-      <w:r>
-        <w:t xml:space="preserve"> </w:t>
-      </w:r>
-      <w:r>
-        <w:t xml:space="preserve">“</w:t>
-      </w:r>
-      <w:r>
-        <w:t xml:space="preserve">well-lit path</w:t>
-      </w:r>
-      <w:r>
-        <w:t xml:space="preserve">”</w:t>
-      </w:r>
-      <w:r>
-        <w:t xml:space="preserve"> </w:t>
-      </w:r>
-      <w:r>
-        <w:t xml:space="preserve">guides ship their own dedicated</w:t>
-      </w:r>
-      <w:r>
-        <w:t xml:space="preserve"> </w:t>
-      </w:r>
-      <w:r>
-        <w:rPr>
-          <w:rStyle w:val="VerbatimChar"/>
-        </w:rPr>
-        <w:t xml:space="preserve">modelserver/xpu/...</w:t>
-      </w:r>
-      <w:r>
-        <w:t xml:space="preserve"> </w:t>
-      </w:r>
-      <w:r>
-        <w:t xml:space="preserve">overlay,</w:t>
-      </w:r>
-      <w:r>
-        <w:t xml:space="preserve"> </w:t>
-      </w:r>
-      <w:r>
         <w:rPr>
           <w:bCs/>
           <w:b/>
@@ -13279,7 +13240,7 @@
     </w:tbl>
     <w:bookmarkEnd w:id="65"/>
     <w:bookmarkEnd w:id="66"/>
-    <w:bookmarkStart w:id="75" w:name="X902d638eacc236052ea377f4bf633e8bfa67ff8"/>
+    <w:bookmarkStart w:id="74" w:name="X902d638eacc236052ea377f4bf633e8bfa67ff8"/>
     <w:p>
       <w:pPr>
         <w:pStyle w:val="Heading1"/>
@@ -13538,7 +13499,7 @@
               <w:jc w:val="left"/>
             </w:pPr>
             <w:r>
-              <w:t xml:space="preserve">Same routing-layer pattern already proven hardware-agnostic on the llm-d side of this whitepaper</w:t>
+              <w:t xml:space="preserve">Same routing-layer pattern (EPP/InferencePool) already proven hardware-agnostic elsewhere</w:t>
             </w:r>
           </w:p>
         </w:tc>
@@ -14160,13 +14121,21 @@
       </w:r>
     </w:p>
     <w:bookmarkEnd w:id="72"/>
-    <w:bookmarkStart w:id="73" w:name="X60879ca28c7302647f9608367a1ce4d16915dfd"/>
+    <w:bookmarkStart w:id="73" w:name="if-you-want-to-close-these-gaps"/>
     <w:p>
       <w:pPr>
         <w:pStyle w:val="Heading2"/>
       </w:pPr>
       <w:r>
-        <w:t xml:space="preserve">Also worth noting: llm-d’s own</w:t>
+        <w:t xml:space="preserve">If you want to close these gaps</w:t>
+      </w:r>
+    </w:p>
+    <w:p>
+      <w:pPr>
+        <w:pStyle w:val="FirstParagraph"/>
+      </w:pPr>
+      <w:r>
+        <w:t xml:space="preserve">Building and validating any of the</w:t>
       </w:r>
       <w:r>
         <w:t xml:space="preserve"> </w:t>
@@ -14175,7 +14144,7 @@
         <w:t xml:space="preserve">“</w:t>
       </w:r>
       <w:r>
-        <w:t xml:space="preserve">feasible but not templated</w:t>
+        <w:t xml:space="preserve">feasible</w:t>
       </w:r>
       <w:r>
         <w:t xml:space="preserve">”</w:t>
@@ -14184,254 +14153,84 @@
         <w:t xml:space="preserve"> </w:t>
       </w:r>
       <w:r>
-        <w:t xml:space="preserve">case</w:t>
-      </w:r>
-    </w:p>
-    <w:p>
-      <w:pPr>
-        <w:pStyle w:val="FirstParagraph"/>
-      </w:pPr>
-      <w:r>
-        <w:t xml:space="preserve">The llm-d side of this whitepaper has one directly analogous case:</w:t>
-      </w:r>
-      <w:r>
-        <w:t xml:space="preserve"> </w:t>
-      </w:r>
-      <w:r>
-        <w:rPr>
-          <w:rStyle w:val="VerbatimChar"/>
-          <w:bCs/>
-          <w:b/>
-        </w:rPr>
-        <w:t xml:space="preserve">guides/rl</w:t>
-      </w:r>
-      <w:r>
-        <w:t xml:space="preserve"> </w:t>
-      </w:r>
-      <w:r>
-        <w:t xml:space="preserve">(</w:t>
-      </w:r>
-      <w:r>
-        <w:rPr>
-          <w:rStyle w:val="VerbatimChar"/>
-        </w:rPr>
-        <w:t xml:space="preserve">verl-integration.md</w:t>
-      </w:r>
-      <w:r>
-        <w:t xml:space="preserve">, RLHF/GRPO training routing via the llm-d scheduler). Its guide contains</w:t>
-      </w:r>
-      <w:r>
-        <w:t xml:space="preserve"> </w:t>
-      </w:r>
-      <w:r>
-        <w:rPr>
-          <w:bCs/>
-          <w:b/>
-        </w:rPr>
-        <w:t xml:space="preserve">zero</w:t>
-      </w:r>
-      <w:r>
-        <w:t xml:space="preserve"> </w:t>
-      </w:r>
-      <w:r>
-        <w:t xml:space="preserve">hardware-specific references (no CUDA, NVIDIA, or XPU mentions at all) — it overrides</w:t>
-      </w:r>
-      <w:r>
-        <w:t xml:space="preserve"> </w:t>
-      </w:r>
-      <w:r>
-        <w:t xml:space="preserve">verl’s request routing to</w:t>
-      </w:r>
-      <w:r>
-        <w:t xml:space="preserve"> </w:t>
-      </w:r>
-      <w:r>
-        <w:t xml:space="preserve">“</w:t>
-      </w:r>
-      <w:r>
-        <w:t xml:space="preserve">vLLM/SGLang actors on Ray,</w:t>
-      </w:r>
-      <w:r>
-        <w:t xml:space="preserve">”</w:t>
-      </w:r>
-      <w:r>
-        <w:t xml:space="preserve"> </w:t>
-      </w:r>
-      <w:r>
-        <w:t xml:space="preserve">the same routing-layer pattern as</w:t>
-      </w:r>
-      <w:r>
-        <w:t xml:space="preserve"> </w:t>
-      </w:r>
-      <w:r>
-        <w:t xml:space="preserve">Flow Control and Multi-Model Routing (Chapters 2 and 3 of the companion llm-d whitepaper),</w:t>
-      </w:r>
-      <w:r>
-        <w:t xml:space="preserve"> </w:t>
-      </w:r>
-      <w:r>
-        <w:t xml:space="preserve">both of which are already confirmed hardware-agnostic and Intel-XPU-compatible there.</w:t>
-      </w:r>
-      <w:r>
-        <w:t xml:space="preserve"> </w:t>
-      </w:r>
-      <w:r>
-        <w:t xml:space="preserve">This makes</w:t>
-      </w:r>
-      <w:r>
-        <w:t xml:space="preserve"> </w:t>
-      </w:r>
-      <w:r>
-        <w:rPr>
-          <w:rStyle w:val="VerbatimChar"/>
-        </w:rPr>
-        <w:t xml:space="preserve">guides/rl</w:t>
-      </w:r>
-      <w:r>
-        <w:t xml:space="preserve"> </w:t>
-      </w:r>
-      <w:r>
-        <w:t xml:space="preserve">a strong feasible-but-untemplated candidate as well. It is not yet</w:t>
-      </w:r>
-      <w:r>
-        <w:t xml:space="preserve"> </w:t>
-      </w:r>
-      <w:r>
-        <w:t xml:space="preserve">written as a full chapter in the llm-d whitepaper — see</w:t>
-      </w:r>
-      <w:r>
-        <w:t xml:space="preserve"> </w:t>
-      </w:r>
-      <w:r>
-        <w:rPr>
-          <w:rStyle w:val="VerbatimChar"/>
-        </w:rPr>
-        <w:t xml:space="preserve">llm-d/tracking.md</w:t>
-      </w:r>
-      <w:r>
-        <w:t xml:space="preserve"> </w:t>
-      </w:r>
-      <w:r>
-        <w:t xml:space="preserve">for the</w:t>
-      </w:r>
-      <w:r>
-        <w:t xml:space="preserve"> </w:t>
-      </w:r>
-      <w:r>
-        <w:t xml:space="preserve">open scope question.</w:t>
+        <w:t xml:space="preserve">candidates above on real Intel XPU hardware, then</w:t>
+      </w:r>
+      <w:r>
+        <w:t xml:space="preserve"> </w:t>
+      </w:r>
+      <w:r>
+        <w:t xml:space="preserve">contributing the resulting</w:t>
+      </w:r>
+      <w:r>
+        <w:t xml:space="preserve"> </w:t>
+      </w:r>
+      <w:r>
+        <w:rPr>
+          <w:rStyle w:val="VerbatimChar"/>
+        </w:rPr>
+        <w:t xml:space="preserve">xpu/</w:t>
+      </w:r>
+      <w:r>
+        <w:t xml:space="preserve"> </w:t>
+      </w:r>
+      <w:r>
+        <w:t xml:space="preserve">template upstream, is the most direct way to expand real Intel</w:t>
+      </w:r>
+      <w:r>
+        <w:t xml:space="preserve"> </w:t>
+      </w:r>
+      <w:r>
+        <w:t xml:space="preserve">XPU coverage — following the structural pattern of Chapter 1’s existing 8 templates (Intel DRA</w:t>
+      </w:r>
+      <w:r>
+        <w:t xml:space="preserve"> </w:t>
+      </w:r>
+      <w:r>
+        <w:t xml:space="preserve">device class</w:t>
+      </w:r>
+      <w:r>
+        <w:t xml:space="preserve"> </w:t>
+      </w:r>
+      <w:r>
+        <w:rPr>
+          <w:rStyle w:val="VerbatimChar"/>
+        </w:rPr>
+        <w:t xml:space="preserve">gpu.intel.com</w:t>
+      </w:r>
+      <w:r>
+        <w:t xml:space="preserve">, XCCL/</w:t>
+      </w:r>
+      <w:r>
+        <w:rPr>
+          <w:rStyle w:val="VerbatimChar"/>
+        </w:rPr>
+        <w:t xml:space="preserve">ze_copy</w:t>
+      </w:r>
+      <w:r>
+        <w:t xml:space="preserve"> </w:t>
+      </w:r>
+      <w:r>
+        <w:t xml:space="preserve">transport where NIXL/UCX is involved, custom</w:t>
+      </w:r>
+      <w:r>
+        <w:t xml:space="preserve"> </w:t>
+      </w:r>
+      <w:r>
+        <w:rPr>
+          <w:rStyle w:val="VerbatimChar"/>
+        </w:rPr>
+        <w:t xml:space="preserve">vllm-runtime-xpu</w:t>
+      </w:r>
+      <w:r>
+        <w:t xml:space="preserve"> </w:t>
+      </w:r>
+      <w:r>
+        <w:t xml:space="preserve">image).</w:t>
       </w:r>
     </w:p>
     <w:bookmarkEnd w:id="73"/>
-    <w:bookmarkStart w:id="74" w:name="if-you-want-to-close-these-gaps"/>
-    <w:p>
-      <w:pPr>
-        <w:pStyle w:val="Heading2"/>
-      </w:pPr>
-      <w:r>
-        <w:t xml:space="preserve">If you want to close these gaps</w:t>
-      </w:r>
-    </w:p>
-    <w:p>
-      <w:pPr>
-        <w:pStyle w:val="FirstParagraph"/>
-      </w:pPr>
-      <w:r>
-        <w:t xml:space="preserve">Building and validating any of the</w:t>
-      </w:r>
-      <w:r>
-        <w:t xml:space="preserve"> </w:t>
-      </w:r>
-      <w:r>
-        <w:t xml:space="preserve">“</w:t>
-      </w:r>
-      <w:r>
-        <w:t xml:space="preserve">feasible</w:t>
-      </w:r>
-      <w:r>
-        <w:t xml:space="preserve">”</w:t>
-      </w:r>
-      <w:r>
-        <w:t xml:space="preserve"> </w:t>
-      </w:r>
-      <w:r>
-        <w:t xml:space="preserve">candidates above on real Intel XPU hardware, then</w:t>
-      </w:r>
-      <w:r>
-        <w:t xml:space="preserve"> </w:t>
-      </w:r>
-      <w:r>
-        <w:t xml:space="preserve">contributing the resulting</w:t>
-      </w:r>
-      <w:r>
-        <w:t xml:space="preserve"> </w:t>
-      </w:r>
-      <w:r>
-        <w:rPr>
-          <w:rStyle w:val="VerbatimChar"/>
-        </w:rPr>
-        <w:t xml:space="preserve">xpu/</w:t>
-      </w:r>
-      <w:r>
-        <w:t xml:space="preserve"> </w:t>
-      </w:r>
-      <w:r>
-        <w:t xml:space="preserve">template upstream, is the most direct way to expand real Intel</w:t>
-      </w:r>
-      <w:r>
-        <w:t xml:space="preserve"> </w:t>
-      </w:r>
-      <w:r>
-        <w:t xml:space="preserve">XPU coverage — following the structural pattern of Chapter 1’s existing 8 templates (Intel DRA</w:t>
-      </w:r>
-      <w:r>
-        <w:t xml:space="preserve"> </w:t>
-      </w:r>
-      <w:r>
-        <w:t xml:space="preserve">device class</w:t>
-      </w:r>
-      <w:r>
-        <w:t xml:space="preserve"> </w:t>
-      </w:r>
-      <w:r>
-        <w:rPr>
-          <w:rStyle w:val="VerbatimChar"/>
-        </w:rPr>
-        <w:t xml:space="preserve">gpu.intel.com</w:t>
-      </w:r>
-      <w:r>
-        <w:t xml:space="preserve">, XCCL/</w:t>
-      </w:r>
-      <w:r>
-        <w:rPr>
-          <w:rStyle w:val="VerbatimChar"/>
-        </w:rPr>
-        <w:t xml:space="preserve">ze_copy</w:t>
-      </w:r>
-      <w:r>
-        <w:t xml:space="preserve"> </w:t>
-      </w:r>
-      <w:r>
-        <w:t xml:space="preserve">transport where NIXL/UCX is involved, custom</w:t>
-      </w:r>
-      <w:r>
-        <w:t xml:space="preserve"> </w:t>
-      </w:r>
-      <w:r>
-        <w:rPr>
-          <w:rStyle w:val="VerbatimChar"/>
-        </w:rPr>
-        <w:t xml:space="preserve">vllm-runtime-xpu</w:t>
-      </w:r>
-      <w:r>
-        <w:t xml:space="preserve"> </w:t>
-      </w:r>
-      <w:r>
-        <w:t xml:space="preserve">image).</w:t>
-      </w:r>
-    </w:p>
     <w:bookmarkEnd w:id="74"/>
-    <w:bookmarkEnd w:id="75"/>
-    <w:bookmarkStart w:id="76" w:name="Xdbeb1f083631211312dfbd75b69c56d98d3c4a6"/>
+    <w:bookmarkStart w:id="75" w:name="Xdbeb1f083631211312dfbd75b69c56d98d3c4a6"/>
     <w:p>
       <w:pPr>
         <w:pStyle w:val="Heading1"/>
@@ -14827,8 +14626,8 @@
         </w:tc>
       </w:tr>
     </w:tbl>
-    <w:bookmarkEnd w:id="76"/>
-    <w:bookmarkStart w:id="77" w:name="appendix-b-known-issues-workarounds"/>
+    <w:bookmarkEnd w:id="75"/>
+    <w:bookmarkStart w:id="76" w:name="appendix-b-known-issues-workarounds"/>
     <w:p>
       <w:pPr>
         <w:pStyle w:val="Heading1"/>
@@ -15183,7 +14982,7 @@
         <w:t xml:space="preserve">compatibility matrix.</w:t>
       </w:r>
     </w:p>
-    <w:bookmarkEnd w:id="77"/>
+    <w:bookmarkEnd w:id="76"/>
     <w:sectPr/>
   </w:body>
 </w:document>

</xml_diff>